<commit_message>
Regenerate stage2-report.pdf and stage2-report.docx
Co-Authored-By: Claude Opus 5.5 <noreply@anthropic.com>
Claude-Session: https://claude.ai/code/session_01BGUz2BeMm2jKqoLeqom7HW
</commit_message>
<xml_diff>
--- a/stage2-report.docx
+++ b/stage2-report.docx
@@ -30,7 +30,9 @@
       </w:r>
       <w:r>
         <w:rPr/>
-        <w:t xml:space="preserve"> Repository: </w:t>
+        <w:t xml:space="preserve"> Author: Shivam Glotra (individual project)</w:t>
+        <w:br/>
+        <w:t xml:space="preserve">Repository: </w:t>
       </w:r>
       <w:hyperlink r:id="rId2">
         <w:r>
@@ -50,17 +52,7 @@
       </w:pPr>
       <w:r>
         <w:rPr/>
-        <w:t xml:space="preserve">Fields marked </w:t>
-      </w:r>
-      <w:r>
-        <w:rPr>
-          <w:rStyle w:val="Strong"/>
-        </w:rPr>
-        <w:t>[Team]</w:t>
-      </w:r>
-      <w:r>
-        <w:rPr/>
-        <w:t xml:space="preserve"> are facts only the team can supply (video links, other tools used, the team's own review notes). Fill them in before exporting the final PDF.</w:t>
+        <w:t>Still to add before submission: the video links (§7), the commits of 3–9 November (§6.1), and the LLM model name in §5.1.</w:t>
       </w:r>
     </w:p>
     <w:p>
@@ -369,9 +361,9 @@
         </w:tblCellMar>
       </w:tblPr>
       <w:tblGrid>
-        <w:gridCol w:w="4540"/>
-        <w:gridCol w:w="2290"/>
-        <w:gridCol w:w="3374"/>
+        <w:gridCol w:w="4308"/>
+        <w:gridCol w:w="2384"/>
+        <w:gridCol w:w="3512"/>
       </w:tblGrid>
       <w:tr>
         <w:trPr>
@@ -379,7 +371,7 @@
         </w:trPr>
         <w:tc>
           <w:tcPr>
-            <w:tcW w:w="4540" w:type="dxa"/>
+            <w:tcW w:w="4308" w:type="dxa"/>
             <w:tcBorders>
               <w:top w:val="single" w:sz="6" w:space="0" w:color="808080"/>
               <w:left w:val="single" w:sz="6" w:space="0" w:color="808080"/>
@@ -405,7 +397,7 @@
         </w:tc>
         <w:tc>
           <w:tcPr>
-            <w:tcW w:w="2290" w:type="dxa"/>
+            <w:tcW w:w="2384" w:type="dxa"/>
             <w:tcBorders>
               <w:top w:val="single" w:sz="6" w:space="0" w:color="808080"/>
               <w:left w:val="single" w:sz="2" w:space="0" w:color="808080"/>
@@ -431,7 +423,7 @@
         </w:tc>
         <w:tc>
           <w:tcPr>
-            <w:tcW w:w="3374" w:type="dxa"/>
+            <w:tcW w:w="3512" w:type="dxa"/>
             <w:tcBorders>
               <w:top w:val="single" w:sz="6" w:space="0" w:color="808080"/>
               <w:left w:val="single" w:sz="2" w:space="0" w:color="808080"/>
@@ -460,7 +452,7 @@
         <w:trPr/>
         <w:tc>
           <w:tcPr>
-            <w:tcW w:w="4540" w:type="dxa"/>
+            <w:tcW w:w="4308" w:type="dxa"/>
             <w:tcBorders>
               <w:left w:val="single" w:sz="6" w:space="0" w:color="808080"/>
               <w:bottom w:val="single" w:sz="2" w:space="0" w:color="808080"/>
@@ -485,7 +477,7 @@
         </w:tc>
         <w:tc>
           <w:tcPr>
-            <w:tcW w:w="2290" w:type="dxa"/>
+            <w:tcW w:w="2384" w:type="dxa"/>
             <w:tcBorders>
               <w:left w:val="single" w:sz="2" w:space="0" w:color="808080"/>
               <w:bottom w:val="single" w:sz="2" w:space="0" w:color="808080"/>
@@ -512,7 +504,7 @@
         </w:tc>
         <w:tc>
           <w:tcPr>
-            <w:tcW w:w="3374" w:type="dxa"/>
+            <w:tcW w:w="3512" w:type="dxa"/>
             <w:tcBorders>
               <w:left w:val="single" w:sz="2" w:space="0" w:color="808080"/>
               <w:bottom w:val="single" w:sz="2" w:space="0" w:color="808080"/>
@@ -540,7 +532,7 @@
         <w:trPr/>
         <w:tc>
           <w:tcPr>
-            <w:tcW w:w="4540" w:type="dxa"/>
+            <w:tcW w:w="4308" w:type="dxa"/>
             <w:tcBorders>
               <w:left w:val="single" w:sz="6" w:space="0" w:color="808080"/>
               <w:bottom w:val="single" w:sz="2" w:space="0" w:color="808080"/>
@@ -565,7 +557,7 @@
         </w:tc>
         <w:tc>
           <w:tcPr>
-            <w:tcW w:w="2290" w:type="dxa"/>
+            <w:tcW w:w="2384" w:type="dxa"/>
             <w:tcBorders>
               <w:left w:val="single" w:sz="2" w:space="0" w:color="808080"/>
               <w:bottom w:val="single" w:sz="2" w:space="0" w:color="808080"/>
@@ -592,7 +584,7 @@
         </w:tc>
         <w:tc>
           <w:tcPr>
-            <w:tcW w:w="3374" w:type="dxa"/>
+            <w:tcW w:w="3512" w:type="dxa"/>
             <w:tcBorders>
               <w:left w:val="single" w:sz="2" w:space="0" w:color="808080"/>
               <w:bottom w:val="single" w:sz="2" w:space="0" w:color="808080"/>
@@ -626,7 +618,7 @@
         <w:trPr/>
         <w:tc>
           <w:tcPr>
-            <w:tcW w:w="4540" w:type="dxa"/>
+            <w:tcW w:w="4308" w:type="dxa"/>
             <w:tcBorders>
               <w:left w:val="single" w:sz="6" w:space="0" w:color="808080"/>
               <w:bottom w:val="single" w:sz="2" w:space="0" w:color="808080"/>
@@ -645,7 +637,7 @@
             </w:pPr>
             <w:r>
               <w:rPr/>
-              <w:t xml:space="preserve">Local model through Ollama (team uses </w:t>
+              <w:t xml:space="preserve">Local model through Ollama (used: </w:t>
             </w:r>
             <w:r>
               <w:rPr>
@@ -661,7 +653,7 @@
         </w:tc>
         <w:tc>
           <w:tcPr>
-            <w:tcW w:w="2290" w:type="dxa"/>
+            <w:tcW w:w="2384" w:type="dxa"/>
             <w:tcBorders>
               <w:left w:val="single" w:sz="2" w:space="0" w:color="808080"/>
               <w:bottom w:val="single" w:sz="2" w:space="0" w:color="808080"/>
@@ -688,7 +680,7 @@
         </w:tc>
         <w:tc>
           <w:tcPr>
-            <w:tcW w:w="3374" w:type="dxa"/>
+            <w:tcW w:w="3512" w:type="dxa"/>
             <w:tcBorders>
               <w:left w:val="single" w:sz="2" w:space="0" w:color="808080"/>
               <w:bottom w:val="single" w:sz="2" w:space="0" w:color="808080"/>
@@ -716,7 +708,7 @@
         <w:trPr/>
         <w:tc>
           <w:tcPr>
-            <w:tcW w:w="4540" w:type="dxa"/>
+            <w:tcW w:w="4308" w:type="dxa"/>
             <w:tcBorders>
               <w:left w:val="single" w:sz="6" w:space="0" w:color="808080"/>
               <w:bottom w:val="single" w:sz="6" w:space="0" w:color="808080"/>
@@ -741,7 +733,7 @@
         </w:tc>
         <w:tc>
           <w:tcPr>
-            <w:tcW w:w="2290" w:type="dxa"/>
+            <w:tcW w:w="2384" w:type="dxa"/>
             <w:tcBorders>
               <w:left w:val="single" w:sz="2" w:space="0" w:color="808080"/>
               <w:bottom w:val="single" w:sz="6" w:space="0" w:color="808080"/>
@@ -778,7 +770,7 @@
         </w:tc>
         <w:tc>
           <w:tcPr>
-            <w:tcW w:w="3374" w:type="dxa"/>
+            <w:tcW w:w="3512" w:type="dxa"/>
             <w:tcBorders>
               <w:left w:val="single" w:sz="2" w:space="0" w:color="808080"/>
               <w:bottom w:val="single" w:sz="6" w:space="0" w:color="808080"/>
@@ -862,11 +854,11 @@
         <w:rPr>
           <w:rStyle w:val="Strong"/>
         </w:rPr>
-        <w:t>129 automated tests (0 failures)</w:t>
-      </w:r>
-      <w:r>
-        <w:rPr/>
-        <w:t>. Gemini and the local Ollama model were run by the team; the Claude path is implemented but was only unit-tested, because no Anthropic key was available.</w:t>
+        <w:t>132 automated tests (0 failures)</w:t>
+      </w:r>
+      <w:r>
+        <w:rPr/>
+        <w:t>. Gemini and the local Ollama model were run by the author; the Claude path is implemented but was only unit-tested, because no Anthropic key was available.</w:t>
       </w:r>
     </w:p>
     <w:p>
@@ -10375,7 +10367,7 @@
     </w:p>
     <w:tbl>
       <w:tblPr>
-        <w:tblW w:w="10664" w:type="dxa"/>
+        <w:tblW w:w="11204" w:type="dxa"/>
         <w:jc w:val="left"/>
         <w:tblInd w:w="-7" w:type="dxa"/>
         <w:tblLayout w:type="fixed"/>
@@ -10391,7 +10383,7 @@
         <w:gridCol w:w="2511"/>
         <w:gridCol w:w="3501"/>
         <w:gridCol w:w="1191"/>
-        <w:gridCol w:w="3126"/>
+        <w:gridCol w:w="3666"/>
       </w:tblGrid>
       <w:tr>
         <w:trPr>
@@ -10503,7 +10495,7 @@
         </w:tc>
         <w:tc>
           <w:tcPr>
-            <w:tcW w:w="3126" w:type="dxa"/>
+            <w:tcW w:w="3666" w:type="dxa"/>
             <w:tcBorders>
               <w:top w:val="single" w:sz="6" w:space="0" w:color="808080"/>
               <w:left w:val="single" w:sz="2" w:space="0" w:color="808080"/>
@@ -10658,7 +10650,7 @@
         </w:tc>
         <w:tc>
           <w:tcPr>
-            <w:tcW w:w="3126" w:type="dxa"/>
+            <w:tcW w:w="3666" w:type="dxa"/>
             <w:tcBorders>
               <w:left w:val="single" w:sz="2" w:space="0" w:color="808080"/>
               <w:bottom w:val="single" w:sz="2" w:space="0" w:color="808080"/>
@@ -10814,7 +10806,7 @@
         </w:tc>
         <w:tc>
           <w:tcPr>
-            <w:tcW w:w="3126" w:type="dxa"/>
+            <w:tcW w:w="3666" w:type="dxa"/>
             <w:tcBorders>
               <w:left w:val="single" w:sz="2" w:space="0" w:color="808080"/>
               <w:bottom w:val="single" w:sz="2" w:space="0" w:color="808080"/>
@@ -10968,13 +10960,13 @@
             </w:pPr>
             <w:r>
               <w:rPr/>
-              <w:t>Free/cheap models for the team (the course allows any cheap or free model); the design planned for provider changes</w:t>
-            </w:r>
-          </w:p>
-        </w:tc>
-        <w:tc>
-          <w:tcPr>
-            <w:tcW w:w="3126" w:type="dxa"/>
+              <w:t>Free/cheap models for the author (the course allows any cheap or free model); the design planned for provider changes</w:t>
+            </w:r>
+          </w:p>
+        </w:tc>
+        <w:tc>
+          <w:tcPr>
+            <w:tcW w:w="3666" w:type="dxa"/>
             <w:tcBorders>
               <w:left w:val="single" w:sz="2" w:space="0" w:color="808080"/>
               <w:bottom w:val="single" w:sz="2" w:space="0" w:color="808080"/>
@@ -11122,7 +11114,7 @@
         </w:tc>
         <w:tc>
           <w:tcPr>
-            <w:tcW w:w="3126" w:type="dxa"/>
+            <w:tcW w:w="3666" w:type="dxa"/>
             <w:tcBorders>
               <w:left w:val="single" w:sz="2" w:space="0" w:color="808080"/>
               <w:bottom w:val="single" w:sz="2" w:space="0" w:color="808080"/>
@@ -11276,7 +11268,7 @@
         </w:tc>
         <w:tc>
           <w:tcPr>
-            <w:tcW w:w="3126" w:type="dxa"/>
+            <w:tcW w:w="3666" w:type="dxa"/>
             <w:tcBorders>
               <w:left w:val="single" w:sz="2" w:space="0" w:color="808080"/>
               <w:bottom w:val="single" w:sz="2" w:space="0" w:color="808080"/>
@@ -11420,7 +11412,7 @@
         </w:tc>
         <w:tc>
           <w:tcPr>
-            <w:tcW w:w="3126" w:type="dxa"/>
+            <w:tcW w:w="3666" w:type="dxa"/>
             <w:tcBorders>
               <w:left w:val="single" w:sz="2" w:space="0" w:color="808080"/>
               <w:bottom w:val="single" w:sz="2" w:space="0" w:color="808080"/>
@@ -11570,7 +11562,7 @@
         </w:tc>
         <w:tc>
           <w:tcPr>
-            <w:tcW w:w="3126" w:type="dxa"/>
+            <w:tcW w:w="3666" w:type="dxa"/>
             <w:tcBorders>
               <w:left w:val="single" w:sz="2" w:space="0" w:color="808080"/>
               <w:bottom w:val="single" w:sz="2" w:space="0" w:color="808080"/>
@@ -11683,7 +11675,7 @@
             </w:r>
             <w:r>
               <w:rPr/>
-              <w:t>; "Clean Slate" design chosen by the team</w:t>
+              <w:t>; "Clean Slate" design chosen by the author</w:t>
             </w:r>
           </w:p>
         </w:tc>
@@ -11714,7 +11706,7 @@
         </w:tc>
         <w:tc>
           <w:tcPr>
-            <w:tcW w:w="3126" w:type="dxa"/>
+            <w:tcW w:w="3666" w:type="dxa"/>
             <w:tcBorders>
               <w:left w:val="single" w:sz="2" w:space="0" w:color="808080"/>
               <w:bottom w:val="single" w:sz="2" w:space="0" w:color="808080"/>
@@ -11954,7 +11946,7 @@
         </w:tc>
         <w:tc>
           <w:tcPr>
-            <w:tcW w:w="3126" w:type="dxa"/>
+            <w:tcW w:w="3666" w:type="dxa"/>
             <w:tcBorders>
               <w:left w:val="single" w:sz="2" w:space="0" w:color="808080"/>
               <w:bottom w:val="single" w:sz="2" w:space="0" w:color="808080"/>
@@ -12092,7 +12084,7 @@
         </w:tc>
         <w:tc>
           <w:tcPr>
-            <w:tcW w:w="3126" w:type="dxa"/>
+            <w:tcW w:w="3666" w:type="dxa"/>
             <w:tcBorders>
               <w:left w:val="single" w:sz="2" w:space="0" w:color="808080"/>
               <w:bottom w:val="single" w:sz="2" w:space="0" w:color="808080"/>
@@ -12236,7 +12228,7 @@
         </w:tc>
         <w:tc>
           <w:tcPr>
-            <w:tcW w:w="3126" w:type="dxa"/>
+            <w:tcW w:w="3666" w:type="dxa"/>
             <w:tcBorders>
               <w:left w:val="single" w:sz="2" w:space="0" w:color="808080"/>
               <w:bottom w:val="single" w:sz="2" w:space="0" w:color="808080"/>
@@ -12368,7 +12360,7 @@
         </w:tc>
         <w:tc>
           <w:tcPr>
-            <w:tcW w:w="3126" w:type="dxa"/>
+            <w:tcW w:w="3666" w:type="dxa"/>
             <w:tcBorders>
               <w:left w:val="single" w:sz="2" w:space="0" w:color="808080"/>
               <w:bottom w:val="single" w:sz="2" w:space="0" w:color="808080"/>
@@ -12518,7 +12510,7 @@
         </w:tc>
         <w:tc>
           <w:tcPr>
-            <w:tcW w:w="3126" w:type="dxa"/>
+            <w:tcW w:w="3666" w:type="dxa"/>
             <w:tcBorders>
               <w:left w:val="single" w:sz="2" w:space="0" w:color="808080"/>
               <w:bottom w:val="single" w:sz="2" w:space="0" w:color="808080"/>
@@ -12646,7 +12638,7 @@
         </w:tc>
         <w:tc>
           <w:tcPr>
-            <w:tcW w:w="3126" w:type="dxa"/>
+            <w:tcW w:w="3666" w:type="dxa"/>
             <w:tcBorders>
               <w:left w:val="single" w:sz="2" w:space="0" w:color="808080"/>
               <w:bottom w:val="single" w:sz="2" w:space="0" w:color="808080"/>
@@ -12776,7 +12768,7 @@
         </w:tc>
         <w:tc>
           <w:tcPr>
-            <w:tcW w:w="3126" w:type="dxa"/>
+            <w:tcW w:w="3666" w:type="dxa"/>
             <w:tcBorders>
               <w:left w:val="single" w:sz="2" w:space="0" w:color="808080"/>
               <w:bottom w:val="single" w:sz="2" w:space="0" w:color="808080"/>
@@ -12809,6 +12801,150 @@
             <w:tcW w:w="335" w:type="dxa"/>
             <w:tcBorders>
               <w:left w:val="single" w:sz="6" w:space="0" w:color="808080"/>
+              <w:bottom w:val="single" w:sz="2" w:space="0" w:color="808080"/>
+              <w:right w:val="single" w:sz="6" w:space="0" w:color="808080"/>
+            </w:tcBorders>
+            <w:vAlign w:val="center"/>
+          </w:tcPr>
+          <w:p>
+            <w:pPr>
+              <w:pStyle w:val="TableContents"/>
+              <w:widowControl w:val="false"/>
+              <w:suppressLineNumbers/>
+              <w:bidi w:val="0"/>
+              <w:jc w:val="left"/>
+              <w:rPr/>
+            </w:pPr>
+            <w:r>
+              <w:rPr/>
+              <w:t>16</w:t>
+            </w:r>
+          </w:p>
+        </w:tc>
+        <w:tc>
+          <w:tcPr>
+            <w:tcW w:w="2511" w:type="dxa"/>
+            <w:tcBorders>
+              <w:left w:val="single" w:sz="2" w:space="0" w:color="808080"/>
+              <w:bottom w:val="single" w:sz="2" w:space="0" w:color="808080"/>
+              <w:right w:val="single" w:sz="6" w:space="0" w:color="808080"/>
+            </w:tcBorders>
+            <w:vAlign w:val="center"/>
+          </w:tcPr>
+          <w:p>
+            <w:pPr>
+              <w:pStyle w:val="TableContents"/>
+              <w:widowControl w:val="false"/>
+              <w:suppressLineNumbers/>
+              <w:bidi w:val="0"/>
+              <w:jc w:val="left"/>
+              <w:rPr/>
+            </w:pPr>
+            <w:r>
+              <w:rPr/>
+              <w:t>Numbers in a request read as digits only ("9.5 days" was read as 5 days)</w:t>
+            </w:r>
+          </w:p>
+        </w:tc>
+        <w:tc>
+          <w:tcPr>
+            <w:tcW w:w="3501" w:type="dxa"/>
+            <w:tcBorders>
+              <w:left w:val="single" w:sz="2" w:space="0" w:color="808080"/>
+              <w:bottom w:val="single" w:sz="2" w:space="0" w:color="808080"/>
+              <w:right w:val="single" w:sz="6" w:space="0" w:color="808080"/>
+            </w:tcBorders>
+            <w:vAlign w:val="center"/>
+          </w:tcPr>
+          <w:p>
+            <w:pPr>
+              <w:pStyle w:val="TableContents"/>
+              <w:widowControl w:val="false"/>
+              <w:suppressLineNumbers/>
+              <w:bidi w:val="0"/>
+              <w:jc w:val="left"/>
+              <w:rPr/>
+            </w:pPr>
+            <w:r>
+              <w:rPr/>
+              <w:t>Decimals are read; days round to the nearest whole day, a half toward 5–7; recipe counts and servings round to nearest; time limits round down; huge numbers are an error</w:t>
+            </w:r>
+          </w:p>
+        </w:tc>
+        <w:tc>
+          <w:tcPr>
+            <w:tcW w:w="1191" w:type="dxa"/>
+            <w:tcBorders>
+              <w:left w:val="single" w:sz="2" w:space="0" w:color="808080"/>
+              <w:bottom w:val="single" w:sz="2" w:space="0" w:color="808080"/>
+              <w:right w:val="single" w:sz="6" w:space="0" w:color="808080"/>
+            </w:tcBorders>
+            <w:vAlign w:val="center"/>
+          </w:tcPr>
+          <w:p>
+            <w:pPr>
+              <w:pStyle w:val="TableContents"/>
+              <w:widowControl w:val="false"/>
+              <w:suppressLineNumbers/>
+              <w:bidi w:val="0"/>
+              <w:jc w:val="left"/>
+              <w:rPr/>
+            </w:pPr>
+            <w:r>
+              <w:rPr/>
+              <w:t>A user found that "dinner for 9.5 days" silently produced a 5-day plan</w:t>
+            </w:r>
+          </w:p>
+        </w:tc>
+        <w:tc>
+          <w:tcPr>
+            <w:tcW w:w="3666" w:type="dxa"/>
+            <w:tcBorders>
+              <w:left w:val="single" w:sz="2" w:space="0" w:color="808080"/>
+              <w:bottom w:val="single" w:sz="2" w:space="0" w:color="808080"/>
+              <w:right w:val="single" w:sz="6" w:space="0" w:color="808080"/>
+            </w:tcBorders>
+            <w:vAlign w:val="center"/>
+          </w:tcPr>
+          <w:p>
+            <w:pPr>
+              <w:pStyle w:val="TableContents"/>
+              <w:widowControl w:val="false"/>
+              <w:suppressLineNumbers/>
+              <w:bidi w:val="0"/>
+              <w:jc w:val="left"/>
+              <w:rPr/>
+            </w:pPr>
+            <w:r>
+              <w:rPr>
+                <w:rStyle w:val="SourceText"/>
+              </w:rPr>
+              <w:t>RequestConstraints.roundTowardRange</w:t>
+            </w:r>
+            <w:r>
+              <w:rPr/>
+              <w:t xml:space="preserve">, </w:t>
+            </w:r>
+            <w:r>
+              <w:rPr>
+                <w:rStyle w:val="SourceText"/>
+              </w:rPr>
+              <w:t>number</w:t>
+            </w:r>
+            <w:r>
+              <w:rPr/>
+              <w:t>; two tests</w:t>
+            </w:r>
+          </w:p>
+        </w:tc>
+      </w:tr>
+      <w:tr>
+        <w:trPr/>
+        <w:tc>
+          <w:tcPr>
+            <w:tcW w:w="335" w:type="dxa"/>
+            <w:tcBorders>
+              <w:left w:val="single" w:sz="6" w:space="0" w:color="808080"/>
               <w:bottom w:val="single" w:sz="6" w:space="0" w:color="808080"/>
               <w:right w:val="single" w:sz="6" w:space="0" w:color="808080"/>
             </w:tcBorders>
@@ -12825,7 +12961,7 @@
             </w:pPr>
             <w:r>
               <w:rPr/>
-              <w:t>16</w:t>
+              <w:t>17</w:t>
             </w:r>
           </w:p>
         </w:tc>
@@ -12938,7 +13074,7 @@
         </w:tc>
         <w:tc>
           <w:tcPr>
-            <w:tcW w:w="3126" w:type="dxa"/>
+            <w:tcW w:w="3666" w:type="dxa"/>
             <w:tcBorders>
               <w:left w:val="single" w:sz="2" w:space="0" w:color="808080"/>
               <w:bottom w:val="single" w:sz="6" w:space="0" w:color="808080"/>
@@ -13020,7 +13156,7 @@
       </w:r>
       <w:r>
         <w:rPr/>
-        <w:t xml:space="preserve"> forces the mock. (3) Why: the course allows cheap or free models and the team wanted to compare a free local model with a cloud model; the Stage 1 design already promised provider independence. (4) User need: users without a paid key can still use a real LLM (local Ollama), and everyone can run offline. (5) Affected: new UC11 and SD07; classes </w:t>
+        <w:t xml:space="preserve"> forces the mock. (3) Why: the course allows cheap or free models and the author wanted to compare a free local model with a cloud model; the Stage 1 design already promised provider independence. (4) User need: users without a paid key can still use a real LLM (local Ollama), and everyone can run offline. (5) Affected: new UC11 and SD07; classes </w:t>
       </w:r>
       <w:r>
         <w:rPr>
@@ -13478,10 +13614,10 @@
         </w:tblCellMar>
       </w:tblPr>
       <w:tblGrid>
-        <w:gridCol w:w="2121"/>
-        <w:gridCol w:w="1274"/>
-        <w:gridCol w:w="3441"/>
-        <w:gridCol w:w="3369"/>
+        <w:gridCol w:w="1517"/>
+        <w:gridCol w:w="1081"/>
+        <w:gridCol w:w="3820"/>
+        <w:gridCol w:w="3787"/>
       </w:tblGrid>
       <w:tr>
         <w:trPr>
@@ -13489,7 +13625,7 @@
         </w:trPr>
         <w:tc>
           <w:tcPr>
-            <w:tcW w:w="2121" w:type="dxa"/>
+            <w:tcW w:w="1517" w:type="dxa"/>
             <w:tcBorders>
               <w:top w:val="single" w:sz="6" w:space="0" w:color="808080"/>
               <w:left w:val="single" w:sz="6" w:space="0" w:color="808080"/>
@@ -13515,7 +13651,7 @@
         </w:tc>
         <w:tc>
           <w:tcPr>
-            <w:tcW w:w="1274" w:type="dxa"/>
+            <w:tcW w:w="1081" w:type="dxa"/>
             <w:tcBorders>
               <w:top w:val="single" w:sz="6" w:space="0" w:color="808080"/>
               <w:left w:val="single" w:sz="2" w:space="0" w:color="808080"/>
@@ -13541,7 +13677,7 @@
         </w:tc>
         <w:tc>
           <w:tcPr>
-            <w:tcW w:w="3441" w:type="dxa"/>
+            <w:tcW w:w="3820" w:type="dxa"/>
             <w:tcBorders>
               <w:top w:val="single" w:sz="6" w:space="0" w:color="808080"/>
               <w:left w:val="single" w:sz="2" w:space="0" w:color="808080"/>
@@ -13567,7 +13703,7 @@
         </w:tc>
         <w:tc>
           <w:tcPr>
-            <w:tcW w:w="3369" w:type="dxa"/>
+            <w:tcW w:w="3787" w:type="dxa"/>
             <w:tcBorders>
               <w:top w:val="single" w:sz="6" w:space="0" w:color="808080"/>
               <w:left w:val="single" w:sz="2" w:space="0" w:color="808080"/>
@@ -13596,182 +13732,7 @@
         <w:trPr/>
         <w:tc>
           <w:tcPr>
-            <w:tcW w:w="2121" w:type="dxa"/>
-            <w:tcBorders>
-              <w:left w:val="single" w:sz="6" w:space="0" w:color="808080"/>
-              <w:bottom w:val="single" w:sz="2" w:space="0" w:color="808080"/>
-              <w:right w:val="single" w:sz="6" w:space="0" w:color="808080"/>
-            </w:tcBorders>
-            <w:vAlign w:val="center"/>
-          </w:tcPr>
-          <w:p>
-            <w:pPr>
-              <w:pStyle w:val="TableContents"/>
-              <w:widowControl w:val="false"/>
-              <w:suppressLineNumbers/>
-              <w:bidi w:val="0"/>
-              <w:jc w:val="left"/>
-              <w:rPr/>
-            </w:pPr>
-            <w:r>
-              <w:rPr>
-                <w:rStyle w:val="Strong"/>
-              </w:rPr>
-              <w:t>Claude Code</w:t>
-            </w:r>
-            <w:r>
-              <w:rPr/>
-              <w:t xml:space="preserve"> (Anthropic's coding agent, used in claude.ai/code cloud sessions)</w:t>
-            </w:r>
-          </w:p>
-        </w:tc>
-        <w:tc>
-          <w:tcPr>
-            <w:tcW w:w="1274" w:type="dxa"/>
-            <w:tcBorders>
-              <w:left w:val="single" w:sz="2" w:space="0" w:color="808080"/>
-              <w:bottom w:val="single" w:sz="2" w:space="0" w:color="808080"/>
-              <w:right w:val="single" w:sz="6" w:space="0" w:color="808080"/>
-            </w:tcBorders>
-            <w:vAlign w:val="center"/>
-          </w:tcPr>
-          <w:p>
-            <w:pPr>
-              <w:pStyle w:val="TableContents"/>
-              <w:widowControl w:val="false"/>
-              <w:suppressLineNumbers/>
-              <w:bidi w:val="0"/>
-              <w:jc w:val="left"/>
-              <w:rPr/>
-            </w:pPr>
-            <w:r>
-              <w:rPr>
-                <w:rStyle w:val="Strong"/>
-              </w:rPr>
-              <w:t>[Team]</w:t>
-            </w:r>
-            <w:r>
-              <w:rPr/>
-              <w:t xml:space="preserve"> — record the model exactly as shown in the Claude Code session details</w:t>
-            </w:r>
-          </w:p>
-        </w:tc>
-        <w:tc>
-          <w:tcPr>
-            <w:tcW w:w="3441" w:type="dxa"/>
-            <w:tcBorders>
-              <w:left w:val="single" w:sz="2" w:space="0" w:color="808080"/>
-              <w:bottom w:val="single" w:sz="2" w:space="0" w:color="808080"/>
-              <w:right w:val="single" w:sz="6" w:space="0" w:color="808080"/>
-            </w:tcBorders>
-            <w:vAlign w:val="center"/>
-          </w:tcPr>
-          <w:p>
-            <w:pPr>
-              <w:pStyle w:val="TableContents"/>
-              <w:widowControl w:val="false"/>
-              <w:suppressLineNumbers/>
-              <w:bidi w:val="0"/>
-              <w:jc w:val="left"/>
-              <w:rPr/>
-            </w:pPr>
-            <w:r>
-              <w:rPr/>
-              <w:t>Generated the implementation of F01–F10 and the five patterns, the GUI redesign, the Gemini/Ollama adapters and the model switcher, most tests, the docs and this report's draft; diagnosed defects A1–A6 and wrote the proposed fixes the team applied; produced the Stage 2 UMLet diagrams</w:t>
-            </w:r>
-          </w:p>
-        </w:tc>
-        <w:tc>
-          <w:tcPr>
-            <w:tcW w:w="3369" w:type="dxa"/>
-            <w:tcBorders>
-              <w:left w:val="single" w:sz="2" w:space="0" w:color="808080"/>
-              <w:bottom w:val="single" w:sz="2" w:space="0" w:color="808080"/>
-              <w:right w:val="single" w:sz="6" w:space="0" w:color="808080"/>
-            </w:tcBorders>
-            <w:vAlign w:val="center"/>
-          </w:tcPr>
-          <w:p>
-            <w:pPr>
-              <w:pStyle w:val="TableContents"/>
-              <w:widowControl w:val="false"/>
-              <w:suppressLineNumbers/>
-              <w:bidi w:val="0"/>
-              <w:jc w:val="left"/>
-              <w:rPr/>
-            </w:pPr>
-            <w:r>
-              <w:rPr/>
-              <w:t xml:space="preserve">One session, 5–29 Oct 2026 (session usage record, as of 29 Oct): </w:t>
-            </w:r>
-            <w:r>
-              <w:rPr>
-                <w:rStyle w:val="Strong"/>
-              </w:rPr>
-              <w:t>93,041</w:t>
-            </w:r>
-            <w:r>
-              <w:rPr/>
-              <w:t xml:space="preserve"> input tokens, </w:t>
-            </w:r>
-            <w:r>
-              <w:rPr>
-                <w:rStyle w:val="Strong"/>
-              </w:rPr>
-              <w:t>751,231</w:t>
-            </w:r>
-            <w:r>
-              <w:rPr/>
-              <w:t xml:space="preserve"> output tokens, </w:t>
-            </w:r>
-            <w:r>
-              <w:rPr>
-                <w:rStyle w:val="Strong"/>
-              </w:rPr>
-              <w:t>139,867,422</w:t>
-            </w:r>
-            <w:r>
-              <w:rPr/>
-              <w:t xml:space="preserve"> cache-read tokens, </w:t>
-            </w:r>
-            <w:r>
-              <w:rPr>
-                <w:rStyle w:val="Strong"/>
-              </w:rPr>
-              <w:t>4,516,068</w:t>
-            </w:r>
-            <w:r>
-              <w:rPr/>
-              <w:t xml:space="preserve"> cache-write tokens; reported cost </w:t>
-            </w:r>
-            <w:r>
-              <w:rPr>
-                <w:rStyle w:val="Strong"/>
-              </w:rPr>
-              <w:t>≈ US$79.01</w:t>
-            </w:r>
-            <w:r>
-              <w:rPr/>
-              <w:t xml:space="preserve">. </w:t>
-            </w:r>
-            <w:r>
-              <w:rPr>
-                <w:rStyle w:val="Strong"/>
-              </w:rPr>
-              <w:t>[Team]</w:t>
-            </w:r>
-            <w:r>
-              <w:rPr/>
-              <w:t xml:space="preserve"> update with the final numbers and state whether this was billed or covered by a subscription.</w:t>
-            </w:r>
-          </w:p>
-        </w:tc>
-      </w:tr>
-      <w:tr>
-        <w:trPr/>
-        <w:tc>
-          <w:tcPr>
-            <w:tcW w:w="2121" w:type="dxa"/>
+            <w:tcW w:w="1517" w:type="dxa"/>
             <w:tcBorders>
               <w:left w:val="single" w:sz="6" w:space="0" w:color="808080"/>
               <w:bottom w:val="single" w:sz="6" w:space="0" w:color="808080"/>
@@ -13792,27 +13753,17 @@
               <w:rPr>
                 <w:rStyle w:val="Strong"/>
               </w:rPr>
-              <w:t>[Team]</w:t>
-            </w:r>
-            <w:r>
-              <w:rPr/>
-              <w:t xml:space="preserve"> other tools (e.g. a chat assistant used for the Stage 1 report or for </w:t>
-            </w:r>
-            <w:r>
-              <w:rPr>
-                <w:rStyle w:val="SourceText"/>
-              </w:rPr>
-              <w:t>AIModelFactory</w:t>
-            </w:r>
-            <w:r>
-              <w:rPr/>
-              <w:t>)</w:t>
-            </w:r>
-          </w:p>
-        </w:tc>
-        <w:tc>
-          <w:tcPr>
-            <w:tcW w:w="1274" w:type="dxa"/>
+              <w:t>Claude Code</w:t>
+            </w:r>
+            <w:r>
+              <w:rPr/>
+              <w:t xml:space="preserve"> (Anthropic's coding agent, used in claude.ai/code cloud sessions)</w:t>
+            </w:r>
+          </w:p>
+        </w:tc>
+        <w:tc>
+          <w:tcPr>
+            <w:tcW w:w="1081" w:type="dxa"/>
             <w:tcBorders>
               <w:left w:val="single" w:sz="2" w:space="0" w:color="808080"/>
               <w:bottom w:val="single" w:sz="6" w:space="0" w:color="808080"/>
@@ -13831,63 +13782,125 @@
             </w:pPr>
             <w:r>
               <w:rPr>
+                <w:rStyle w:val="Emphasis"/>
+              </w:rPr>
+              <w:t>(model name as shown in the Claude Code session details)</w:t>
+            </w:r>
+          </w:p>
+        </w:tc>
+        <w:tc>
+          <w:tcPr>
+            <w:tcW w:w="3820" w:type="dxa"/>
+            <w:tcBorders>
+              <w:left w:val="single" w:sz="2" w:space="0" w:color="808080"/>
+              <w:bottom w:val="single" w:sz="6" w:space="0" w:color="808080"/>
+              <w:right w:val="single" w:sz="6" w:space="0" w:color="808080"/>
+            </w:tcBorders>
+            <w:vAlign w:val="center"/>
+          </w:tcPr>
+          <w:p>
+            <w:pPr>
+              <w:pStyle w:val="TableContents"/>
+              <w:widowControl w:val="false"/>
+              <w:suppressLineNumbers/>
+              <w:bidi w:val="0"/>
+              <w:jc w:val="left"/>
+              <w:rPr/>
+            </w:pPr>
+            <w:r>
+              <w:rPr/>
+              <w:t>Generated the implementation of F01–F10 and the five patterns, the GUI redesign, the Gemini/Ollama adapters and the model switcher, most tests, the docs and this report's draft; diagnosed defects A1–A8, wrote the proposed fixes (the author applied A1–A7; A8 was committed by Claude Code at the author's request); produced the Stage 2 UMLet diagrams</w:t>
+            </w:r>
+          </w:p>
+        </w:tc>
+        <w:tc>
+          <w:tcPr>
+            <w:tcW w:w="3787" w:type="dxa"/>
+            <w:tcBorders>
+              <w:left w:val="single" w:sz="2" w:space="0" w:color="808080"/>
+              <w:bottom w:val="single" w:sz="6" w:space="0" w:color="808080"/>
+              <w:right w:val="single" w:sz="6" w:space="0" w:color="808080"/>
+            </w:tcBorders>
+            <w:vAlign w:val="center"/>
+          </w:tcPr>
+          <w:p>
+            <w:pPr>
+              <w:pStyle w:val="TableContents"/>
+              <w:widowControl w:val="false"/>
+              <w:suppressLineNumbers/>
+              <w:bidi w:val="0"/>
+              <w:jc w:val="left"/>
+              <w:rPr/>
+            </w:pPr>
+            <w:r>
+              <w:rPr>
                 <w:rStyle w:val="Strong"/>
               </w:rPr>
-              <w:t>[Team]</w:t>
-            </w:r>
-          </w:p>
-        </w:tc>
-        <w:tc>
-          <w:tcPr>
-            <w:tcW w:w="3441" w:type="dxa"/>
-            <w:tcBorders>
-              <w:left w:val="single" w:sz="2" w:space="0" w:color="808080"/>
-              <w:bottom w:val="single" w:sz="6" w:space="0" w:color="808080"/>
-              <w:right w:val="single" w:sz="6" w:space="0" w:color="808080"/>
-            </w:tcBorders>
-            <w:vAlign w:val="center"/>
-          </w:tcPr>
-          <w:p>
-            <w:pPr>
-              <w:pStyle w:val="TableContents"/>
-              <w:widowControl w:val="false"/>
-              <w:suppressLineNumbers/>
-              <w:bidi w:val="0"/>
-              <w:jc w:val="left"/>
-              <w:rPr/>
-            </w:pPr>
+              <w:t>Money:</w:t>
+            </w:r>
+            <w:r>
+              <w:rPr/>
+              <w:t xml:space="preserve"> a Claude Pro subscription plus the US$100 of welcome usage credits that came with it, fully used; another month of Pro may be needed for Stage 3. </w:t>
+            </w:r>
             <w:r>
               <w:rPr>
                 <w:rStyle w:val="Strong"/>
               </w:rPr>
-              <w:t>[Team]</w:t>
-            </w:r>
-          </w:p>
-        </w:tc>
-        <w:tc>
-          <w:tcPr>
-            <w:tcW w:w="3369" w:type="dxa"/>
-            <w:tcBorders>
-              <w:left w:val="single" w:sz="2" w:space="0" w:color="808080"/>
-              <w:bottom w:val="single" w:sz="6" w:space="0" w:color="808080"/>
-              <w:right w:val="single" w:sz="6" w:space="0" w:color="808080"/>
-            </w:tcBorders>
-            <w:vAlign w:val="center"/>
-          </w:tcPr>
-          <w:p>
-            <w:pPr>
-              <w:pStyle w:val="TableContents"/>
-              <w:widowControl w:val="false"/>
-              <w:suppressLineNumbers/>
-              <w:bidi w:val="0"/>
-              <w:jc w:val="left"/>
-              <w:rPr/>
-            </w:pPr>
+              <w:t>Tokens</w:t>
+            </w:r>
+            <w:r>
+              <w:rPr/>
+              <w:t xml:space="preserve"> (one session, 5–30 Oct 2026, from the session's usage record on 30 Oct): </w:t>
+            </w:r>
             <w:r>
               <w:rPr>
                 <w:rStyle w:val="Strong"/>
               </w:rPr>
-              <w:t>[Team]</w:t>
+              <w:t>94,291</w:t>
+            </w:r>
+            <w:r>
+              <w:rPr/>
+              <w:t xml:space="preserve"> input, </w:t>
+            </w:r>
+            <w:r>
+              <w:rPr>
+                <w:rStyle w:val="Strong"/>
+              </w:rPr>
+              <w:t>923,259</w:t>
+            </w:r>
+            <w:r>
+              <w:rPr/>
+              <w:t xml:space="preserve"> output, </w:t>
+            </w:r>
+            <w:r>
+              <w:rPr>
+                <w:rStyle w:val="Strong"/>
+              </w:rPr>
+              <w:t>228,438,517</w:t>
+            </w:r>
+            <w:r>
+              <w:rPr/>
+              <w:t xml:space="preserve"> cache-read and </w:t>
+            </w:r>
+            <w:r>
+              <w:rPr>
+                <w:rStyle w:val="Strong"/>
+              </w:rPr>
+              <w:t>5,327,924</w:t>
+            </w:r>
+            <w:r>
+              <w:rPr/>
+              <w:t xml:space="preserve"> cache-write tokens; usage valued at </w:t>
+            </w:r>
+            <w:r>
+              <w:rPr>
+                <w:rStyle w:val="Strong"/>
+              </w:rPr>
+              <w:t>≈ US$106.67</w:t>
+            </w:r>
+            <w:r>
+              <w:rPr/>
+              <w:t xml:space="preserve"> at API prices.</w:t>
             </w:r>
           </w:p>
         </w:tc>
@@ -13901,6 +13914,18 @@
         <w:rPr/>
       </w:pPr>
       <w:r>
+        <w:rPr/>
+        <w:t>No other AI tools were used. SmartPlate is an individual project, so every human contribution below is the author's.</w:t>
+      </w:r>
+    </w:p>
+    <w:p>
+      <w:pPr>
+        <w:pStyle w:val="BodyText"/>
+        <w:bidi w:val="0"/>
+        <w:jc w:val="left"/>
+        <w:rPr/>
+      </w:pPr>
+      <w:r>
         <w:rPr>
           <w:rStyle w:val="Strong"/>
         </w:rPr>
@@ -13928,7 +13953,7 @@
       </w:r>
       <w:r>
         <w:rPr/>
-        <w:t xml:space="preserve">), a local Ollama model (team: </w:t>
+        <w:t xml:space="preserve">), a local Ollama model (used: </w:t>
       </w:r>
       <w:r>
         <w:rPr>
@@ -13948,17 +13973,7 @@
       </w:r>
       <w:r>
         <w:rPr/>
-        <w:t xml:space="preserve">). </w:t>
-      </w:r>
-      <w:r>
-        <w:rPr>
-          <w:rStyle w:val="Strong"/>
-        </w:rPr>
-        <w:t>[Team]</w:t>
-      </w:r>
-      <w:r>
-        <w:rPr/>
-        <w:t xml:space="preserve"> add any API cost you incurred while running them.</w:t>
+        <w:t>). Gemini and Ollama were used through free APIs, so running them cost nothing; Claude was not used at run time.</w:t>
       </w:r>
     </w:p>
     <w:p>
@@ -13982,17 +13997,7 @@
       </w:pPr>
       <w:r>
         <w:rPr/>
-        <w:t xml:space="preserve">Drafted from the Claude Code session history; </w:t>
-      </w:r>
-      <w:r>
-        <w:rPr>
-          <w:rStyle w:val="Strong"/>
-        </w:rPr>
-        <w:t>[Team]</w:t>
-      </w:r>
-      <w:r>
-        <w:rPr/>
-        <w:t xml:space="preserve"> confirm each entry and add your own review notes and other interactions.</w:t>
+        <w:t>Drawn from the Claude Code session history and confirmed by the author.</w:t>
       </w:r>
     </w:p>
     <w:tbl>
@@ -14009,12 +14014,12 @@
         </w:tblCellMar>
       </w:tblPr>
       <w:tblGrid>
-        <w:gridCol w:w="513"/>
-        <w:gridCol w:w="1351"/>
-        <w:gridCol w:w="2943"/>
-        <w:gridCol w:w="2521"/>
-        <w:gridCol w:w="1618"/>
-        <w:gridCol w:w="1259"/>
+        <w:gridCol w:w="495"/>
+        <w:gridCol w:w="1337"/>
+        <w:gridCol w:w="2832"/>
+        <w:gridCol w:w="2894"/>
+        <w:gridCol w:w="1445"/>
+        <w:gridCol w:w="1202"/>
       </w:tblGrid>
       <w:tr>
         <w:trPr>
@@ -14022,7 +14027,7 @@
         </w:trPr>
         <w:tc>
           <w:tcPr>
-            <w:tcW w:w="513" w:type="dxa"/>
+            <w:tcW w:w="495" w:type="dxa"/>
             <w:tcBorders>
               <w:top w:val="single" w:sz="6" w:space="0" w:color="808080"/>
               <w:left w:val="single" w:sz="6" w:space="0" w:color="808080"/>
@@ -14048,7 +14053,7 @@
         </w:tc>
         <w:tc>
           <w:tcPr>
-            <w:tcW w:w="1351" w:type="dxa"/>
+            <w:tcW w:w="1337" w:type="dxa"/>
             <w:tcBorders>
               <w:top w:val="single" w:sz="6" w:space="0" w:color="808080"/>
               <w:left w:val="single" w:sz="2" w:space="0" w:color="808080"/>
@@ -14074,7 +14079,7 @@
         </w:tc>
         <w:tc>
           <w:tcPr>
-            <w:tcW w:w="2943" w:type="dxa"/>
+            <w:tcW w:w="2832" w:type="dxa"/>
             <w:tcBorders>
               <w:top w:val="single" w:sz="6" w:space="0" w:color="808080"/>
               <w:left w:val="single" w:sz="2" w:space="0" w:color="808080"/>
@@ -14100,7 +14105,7 @@
         </w:tc>
         <w:tc>
           <w:tcPr>
-            <w:tcW w:w="2521" w:type="dxa"/>
+            <w:tcW w:w="2894" w:type="dxa"/>
             <w:tcBorders>
               <w:top w:val="single" w:sz="6" w:space="0" w:color="808080"/>
               <w:left w:val="single" w:sz="2" w:space="0" w:color="808080"/>
@@ -14126,7 +14131,7 @@
         </w:tc>
         <w:tc>
           <w:tcPr>
-            <w:tcW w:w="1618" w:type="dxa"/>
+            <w:tcW w:w="1445" w:type="dxa"/>
             <w:tcBorders>
               <w:top w:val="single" w:sz="6" w:space="0" w:color="808080"/>
               <w:left w:val="single" w:sz="2" w:space="0" w:color="808080"/>
@@ -14152,7 +14157,7 @@
         </w:tc>
         <w:tc>
           <w:tcPr>
-            <w:tcW w:w="1259" w:type="dxa"/>
+            <w:tcW w:w="1202" w:type="dxa"/>
             <w:tcBorders>
               <w:top w:val="single" w:sz="6" w:space="0" w:color="808080"/>
               <w:left w:val="single" w:sz="2" w:space="0" w:color="808080"/>
@@ -14181,7 +14186,7 @@
         <w:trPr/>
         <w:tc>
           <w:tcPr>
-            <w:tcW w:w="513" w:type="dxa"/>
+            <w:tcW w:w="495" w:type="dxa"/>
             <w:tcBorders>
               <w:left w:val="single" w:sz="6" w:space="0" w:color="808080"/>
               <w:bottom w:val="single" w:sz="2" w:space="0" w:color="808080"/>
@@ -14206,7 +14211,7 @@
         </w:tc>
         <w:tc>
           <w:tcPr>
-            <w:tcW w:w="1351" w:type="dxa"/>
+            <w:tcW w:w="1337" w:type="dxa"/>
             <w:tcBorders>
               <w:left w:val="single" w:sz="2" w:space="0" w:color="808080"/>
               <w:bottom w:val="single" w:sz="2" w:space="0" w:color="808080"/>
@@ -14231,7 +14236,7 @@
         </w:tc>
         <w:tc>
           <w:tcPr>
-            <w:tcW w:w="2943" w:type="dxa"/>
+            <w:tcW w:w="2832" w:type="dxa"/>
             <w:tcBorders>
               <w:left w:val="single" w:sz="2" w:space="0" w:color="808080"/>
               <w:bottom w:val="single" w:sz="2" w:space="0" w:color="808080"/>
@@ -14256,7 +14261,7 @@
         </w:tc>
         <w:tc>
           <w:tcPr>
-            <w:tcW w:w="2521" w:type="dxa"/>
+            <w:tcW w:w="2894" w:type="dxa"/>
             <w:tcBorders>
               <w:left w:val="single" w:sz="2" w:space="0" w:color="808080"/>
               <w:bottom w:val="single" w:sz="2" w:space="0" w:color="808080"/>
@@ -14281,42 +14286,32 @@
         </w:tc>
         <w:tc>
           <w:tcPr>
-            <w:tcW w:w="1618" w:type="dxa"/>
-            <w:tcBorders>
-              <w:left w:val="single" w:sz="2" w:space="0" w:color="808080"/>
-              <w:bottom w:val="single" w:sz="2" w:space="0" w:color="808080"/>
-              <w:right w:val="single" w:sz="6" w:space="0" w:color="808080"/>
-            </w:tcBorders>
-            <w:vAlign w:val="center"/>
-          </w:tcPr>
-          <w:p>
-            <w:pPr>
-              <w:pStyle w:val="TableContents"/>
-              <w:widowControl w:val="false"/>
-              <w:suppressLineNumbers/>
-              <w:bidi w:val="0"/>
-              <w:jc w:val="left"/>
-              <w:rPr/>
-            </w:pPr>
-            <w:r>
-              <w:rPr/>
-              <w:t xml:space="preserve">Wrote the design that was implemented; chose the branch holding the final design. </w:t>
-            </w:r>
-            <w:r>
-              <w:rPr>
-                <w:rStyle w:val="Strong"/>
-              </w:rPr>
-              <w:t>[Team]</w:t>
-            </w:r>
-            <w:r>
-              <w:rPr/>
-              <w:t xml:space="preserve"> review notes</w:t>
-            </w:r>
-          </w:p>
-        </w:tc>
-        <w:tc>
-          <w:tcPr>
-            <w:tcW w:w="1259" w:type="dxa"/>
+            <w:tcW w:w="1445" w:type="dxa"/>
+            <w:tcBorders>
+              <w:left w:val="single" w:sz="2" w:space="0" w:color="808080"/>
+              <w:bottom w:val="single" w:sz="2" w:space="0" w:color="808080"/>
+              <w:right w:val="single" w:sz="6" w:space="0" w:color="808080"/>
+            </w:tcBorders>
+            <w:vAlign w:val="center"/>
+          </w:tcPr>
+          <w:p>
+            <w:pPr>
+              <w:pStyle w:val="TableContents"/>
+              <w:widowControl w:val="false"/>
+              <w:suppressLineNumbers/>
+              <w:bidi w:val="0"/>
+              <w:jc w:val="left"/>
+              <w:rPr/>
+            </w:pPr>
+            <w:r>
+              <w:rPr/>
+              <w:t>Wrote the design that was implemented; chose the branch holding the final design</w:t>
+            </w:r>
+          </w:p>
+        </w:tc>
+        <w:tc>
+          <w:tcPr>
+            <w:tcW w:w="1202" w:type="dxa"/>
             <w:tcBorders>
               <w:left w:val="single" w:sz="2" w:space="0" w:color="808080"/>
               <w:bottom w:val="single" w:sz="2" w:space="0" w:color="808080"/>
@@ -14354,7 +14349,7 @@
         <w:trPr/>
         <w:tc>
           <w:tcPr>
-            <w:tcW w:w="513" w:type="dxa"/>
+            <w:tcW w:w="495" w:type="dxa"/>
             <w:tcBorders>
               <w:left w:val="single" w:sz="6" w:space="0" w:color="808080"/>
               <w:bottom w:val="single" w:sz="2" w:space="0" w:color="808080"/>
@@ -14379,7 +14374,7 @@
         </w:tc>
         <w:tc>
           <w:tcPr>
-            <w:tcW w:w="1351" w:type="dxa"/>
+            <w:tcW w:w="1337" w:type="dxa"/>
             <w:tcBorders>
               <w:left w:val="single" w:sz="2" w:space="0" w:color="808080"/>
               <w:bottom w:val="single" w:sz="2" w:space="0" w:color="808080"/>
@@ -14404,7 +14399,7 @@
         </w:tc>
         <w:tc>
           <w:tcPr>
-            <w:tcW w:w="2943" w:type="dxa"/>
+            <w:tcW w:w="2832" w:type="dxa"/>
             <w:tcBorders>
               <w:left w:val="single" w:sz="2" w:space="0" w:color="808080"/>
               <w:bottom w:val="single" w:sz="2" w:space="0" w:color="808080"/>
@@ -14429,7 +14424,7 @@
         </w:tc>
         <w:tc>
           <w:tcPr>
-            <w:tcW w:w="2521" w:type="dxa"/>
+            <w:tcW w:w="2894" w:type="dxa"/>
             <w:tcBorders>
               <w:left w:val="single" w:sz="2" w:space="0" w:color="808080"/>
               <w:bottom w:val="single" w:sz="2" w:space="0" w:color="808080"/>
@@ -14454,7 +14449,7 @@
         </w:tc>
         <w:tc>
           <w:tcPr>
-            <w:tcW w:w="1618" w:type="dxa"/>
+            <w:tcW w:w="1445" w:type="dxa"/>
             <w:tcBorders>
               <w:left w:val="single" w:sz="2" w:space="0" w:color="808080"/>
               <w:bottom w:val="single" w:sz="2" w:space="0" w:color="808080"/>
@@ -14479,7 +14474,7 @@
         </w:tc>
         <w:tc>
           <w:tcPr>
-            <w:tcW w:w="1259" w:type="dxa"/>
+            <w:tcW w:w="1202" w:type="dxa"/>
             <w:tcBorders>
               <w:left w:val="single" w:sz="2" w:space="0" w:color="808080"/>
               <w:bottom w:val="single" w:sz="2" w:space="0" w:color="808080"/>
@@ -14507,7 +14502,7 @@
         <w:trPr/>
         <w:tc>
           <w:tcPr>
-            <w:tcW w:w="513" w:type="dxa"/>
+            <w:tcW w:w="495" w:type="dxa"/>
             <w:tcBorders>
               <w:left w:val="single" w:sz="6" w:space="0" w:color="808080"/>
               <w:bottom w:val="single" w:sz="2" w:space="0" w:color="808080"/>
@@ -14532,7 +14527,7 @@
         </w:tc>
         <w:tc>
           <w:tcPr>
-            <w:tcW w:w="1351" w:type="dxa"/>
+            <w:tcW w:w="1337" w:type="dxa"/>
             <w:tcBorders>
               <w:left w:val="single" w:sz="2" w:space="0" w:color="808080"/>
               <w:bottom w:val="single" w:sz="2" w:space="0" w:color="808080"/>
@@ -14557,7 +14552,7 @@
         </w:tc>
         <w:tc>
           <w:tcPr>
-            <w:tcW w:w="2943" w:type="dxa"/>
+            <w:tcW w:w="2832" w:type="dxa"/>
             <w:tcBorders>
               <w:left w:val="single" w:sz="2" w:space="0" w:color="808080"/>
               <w:bottom w:val="single" w:sz="2" w:space="0" w:color="808080"/>
@@ -14582,7 +14577,7 @@
         </w:tc>
         <w:tc>
           <w:tcPr>
-            <w:tcW w:w="2521" w:type="dxa"/>
+            <w:tcW w:w="2894" w:type="dxa"/>
             <w:tcBorders>
               <w:left w:val="single" w:sz="2" w:space="0" w:color="808080"/>
               <w:bottom w:val="single" w:sz="2" w:space="0" w:color="808080"/>
@@ -14607,7 +14602,7 @@
         </w:tc>
         <w:tc>
           <w:tcPr>
-            <w:tcW w:w="1618" w:type="dxa"/>
+            <w:tcW w:w="1445" w:type="dxa"/>
             <w:tcBorders>
               <w:left w:val="single" w:sz="2" w:space="0" w:color="808080"/>
               <w:bottom w:val="single" w:sz="2" w:space="0" w:color="808080"/>
@@ -14632,7 +14627,7 @@
         </w:tc>
         <w:tc>
           <w:tcPr>
-            <w:tcW w:w="1259" w:type="dxa"/>
+            <w:tcW w:w="1202" w:type="dxa"/>
             <w:tcBorders>
               <w:left w:val="single" w:sz="2" w:space="0" w:color="808080"/>
               <w:bottom w:val="single" w:sz="2" w:space="0" w:color="808080"/>
@@ -14660,7 +14655,7 @@
         <w:trPr/>
         <w:tc>
           <w:tcPr>
-            <w:tcW w:w="513" w:type="dxa"/>
+            <w:tcW w:w="495" w:type="dxa"/>
             <w:tcBorders>
               <w:left w:val="single" w:sz="6" w:space="0" w:color="808080"/>
               <w:bottom w:val="single" w:sz="2" w:space="0" w:color="808080"/>
@@ -14685,7 +14680,7 @@
         </w:tc>
         <w:tc>
           <w:tcPr>
-            <w:tcW w:w="1351" w:type="dxa"/>
+            <w:tcW w:w="1337" w:type="dxa"/>
             <w:tcBorders>
               <w:left w:val="single" w:sz="2" w:space="0" w:color="808080"/>
               <w:bottom w:val="single" w:sz="2" w:space="0" w:color="808080"/>
@@ -14710,7 +14705,7 @@
         </w:tc>
         <w:tc>
           <w:tcPr>
-            <w:tcW w:w="2943" w:type="dxa"/>
+            <w:tcW w:w="2832" w:type="dxa"/>
             <w:tcBorders>
               <w:left w:val="single" w:sz="2" w:space="0" w:color="808080"/>
               <w:bottom w:val="single" w:sz="2" w:space="0" w:color="808080"/>
@@ -14735,7 +14730,7 @@
         </w:tc>
         <w:tc>
           <w:tcPr>
-            <w:tcW w:w="2521" w:type="dxa"/>
+            <w:tcW w:w="2894" w:type="dxa"/>
             <w:tcBorders>
               <w:left w:val="single" w:sz="2" w:space="0" w:color="808080"/>
               <w:bottom w:val="single" w:sz="2" w:space="0" w:color="808080"/>
@@ -14760,7 +14755,7 @@
         </w:tc>
         <w:tc>
           <w:tcPr>
-            <w:tcW w:w="1618" w:type="dxa"/>
+            <w:tcW w:w="1445" w:type="dxa"/>
             <w:tcBorders>
               <w:left w:val="single" w:sz="2" w:space="0" w:color="808080"/>
               <w:bottom w:val="single" w:sz="2" w:space="0" w:color="808080"/>
@@ -14785,7 +14780,7 @@
         </w:tc>
         <w:tc>
           <w:tcPr>
-            <w:tcW w:w="1259" w:type="dxa"/>
+            <w:tcW w:w="1202" w:type="dxa"/>
             <w:tcBorders>
               <w:left w:val="single" w:sz="2" w:space="0" w:color="808080"/>
               <w:bottom w:val="single" w:sz="2" w:space="0" w:color="808080"/>
@@ -14823,7 +14818,7 @@
         <w:trPr/>
         <w:tc>
           <w:tcPr>
-            <w:tcW w:w="513" w:type="dxa"/>
+            <w:tcW w:w="495" w:type="dxa"/>
             <w:tcBorders>
               <w:left w:val="single" w:sz="6" w:space="0" w:color="808080"/>
               <w:bottom w:val="single" w:sz="2" w:space="0" w:color="808080"/>
@@ -14848,32 +14843,32 @@
         </w:tc>
         <w:tc>
           <w:tcPr>
-            <w:tcW w:w="1351" w:type="dxa"/>
-            <w:tcBorders>
-              <w:left w:val="single" w:sz="2" w:space="0" w:color="808080"/>
-              <w:bottom w:val="single" w:sz="2" w:space="0" w:color="808080"/>
-              <w:right w:val="single" w:sz="6" w:space="0" w:color="808080"/>
-            </w:tcBorders>
-            <w:vAlign w:val="center"/>
-          </w:tcPr>
-          <w:p>
-            <w:pPr>
-              <w:pStyle w:val="TableContents"/>
-              <w:widowControl w:val="false"/>
-              <w:suppressLineNumbers/>
-              <w:bidi w:val="0"/>
-              <w:jc w:val="left"/>
-              <w:rPr/>
-            </w:pPr>
-            <w:r>
-              <w:rPr/>
-              <w:t>Make the code understandable to the team</w:t>
-            </w:r>
-          </w:p>
-        </w:tc>
-        <w:tc>
-          <w:tcPr>
-            <w:tcW w:w="2943" w:type="dxa"/>
+            <w:tcW w:w="1337" w:type="dxa"/>
+            <w:tcBorders>
+              <w:left w:val="single" w:sz="2" w:space="0" w:color="808080"/>
+              <w:bottom w:val="single" w:sz="2" w:space="0" w:color="808080"/>
+              <w:right w:val="single" w:sz="6" w:space="0" w:color="808080"/>
+            </w:tcBorders>
+            <w:vAlign w:val="center"/>
+          </w:tcPr>
+          <w:p>
+            <w:pPr>
+              <w:pStyle w:val="TableContents"/>
+              <w:widowControl w:val="false"/>
+              <w:suppressLineNumbers/>
+              <w:bidi w:val="0"/>
+              <w:jc w:val="left"/>
+              <w:rPr/>
+            </w:pPr>
+            <w:r>
+              <w:rPr/>
+              <w:t>Make the AI-written code understandable to its author</w:t>
+            </w:r>
+          </w:p>
+        </w:tc>
+        <w:tc>
+          <w:tcPr>
+            <w:tcW w:w="2832" w:type="dxa"/>
             <w:tcBorders>
               <w:left w:val="single" w:sz="2" w:space="0" w:color="808080"/>
               <w:bottom w:val="single" w:sz="2" w:space="0" w:color="808080"/>
@@ -14898,7 +14893,7 @@
         </w:tc>
         <w:tc>
           <w:tcPr>
-            <w:tcW w:w="2521" w:type="dxa"/>
+            <w:tcW w:w="2894" w:type="dxa"/>
             <w:tcBorders>
               <w:left w:val="single" w:sz="2" w:space="0" w:color="808080"/>
               <w:bottom w:val="single" w:sz="2" w:space="0" w:color="808080"/>
@@ -14929,32 +14924,32 @@
         </w:tc>
         <w:tc>
           <w:tcPr>
-            <w:tcW w:w="1618" w:type="dxa"/>
-            <w:tcBorders>
-              <w:left w:val="single" w:sz="2" w:space="0" w:color="808080"/>
-              <w:bottom w:val="single" w:sz="2" w:space="0" w:color="808080"/>
-              <w:right w:val="single" w:sz="6" w:space="0" w:color="808080"/>
-            </w:tcBorders>
-            <w:vAlign w:val="center"/>
-          </w:tcPr>
-          <w:p>
-            <w:pPr>
-              <w:pStyle w:val="TableContents"/>
-              <w:widowControl w:val="false"/>
-              <w:suppressLineNumbers/>
-              <w:bidi w:val="0"/>
-              <w:jc w:val="left"/>
-              <w:rPr/>
-            </w:pPr>
-            <w:r>
-              <w:rPr/>
-              <w:t>Asked for a format the team can learn from and maintain</w:t>
-            </w:r>
-          </w:p>
-        </w:tc>
-        <w:tc>
-          <w:tcPr>
-            <w:tcW w:w="1259" w:type="dxa"/>
+            <w:tcW w:w="1445" w:type="dxa"/>
+            <w:tcBorders>
+              <w:left w:val="single" w:sz="2" w:space="0" w:color="808080"/>
+              <w:bottom w:val="single" w:sz="2" w:space="0" w:color="808080"/>
+              <w:right w:val="single" w:sz="6" w:space="0" w:color="808080"/>
+            </w:tcBorders>
+            <w:vAlign w:val="center"/>
+          </w:tcPr>
+          <w:p>
+            <w:pPr>
+              <w:pStyle w:val="TableContents"/>
+              <w:widowControl w:val="false"/>
+              <w:suppressLineNumbers/>
+              <w:bidi w:val="0"/>
+              <w:jc w:val="left"/>
+              <w:rPr/>
+            </w:pPr>
+            <w:r>
+              <w:rPr/>
+              <w:t>Asked for a format the author can learn from and maintain</w:t>
+            </w:r>
+          </w:p>
+        </w:tc>
+        <w:tc>
+          <w:tcPr>
+            <w:tcW w:w="1202" w:type="dxa"/>
             <w:tcBorders>
               <w:left w:val="single" w:sz="2" w:space="0" w:color="808080"/>
               <w:bottom w:val="single" w:sz="2" w:space="0" w:color="808080"/>
@@ -14982,7 +14977,7 @@
         <w:trPr/>
         <w:tc>
           <w:tcPr>
-            <w:tcW w:w="513" w:type="dxa"/>
+            <w:tcW w:w="495" w:type="dxa"/>
             <w:tcBorders>
               <w:left w:val="single" w:sz="6" w:space="0" w:color="808080"/>
               <w:bottom w:val="single" w:sz="2" w:space="0" w:color="808080"/>
@@ -15007,7 +15002,7 @@
         </w:tc>
         <w:tc>
           <w:tcPr>
-            <w:tcW w:w="1351" w:type="dxa"/>
+            <w:tcW w:w="1337" w:type="dxa"/>
             <w:tcBorders>
               <w:left w:val="single" w:sz="2" w:space="0" w:color="808080"/>
               <w:bottom w:val="single" w:sz="2" w:space="0" w:color="808080"/>
@@ -15032,7 +15027,7 @@
         </w:tc>
         <w:tc>
           <w:tcPr>
-            <w:tcW w:w="2943" w:type="dxa"/>
+            <w:tcW w:w="2832" w:type="dxa"/>
             <w:tcBorders>
               <w:left w:val="single" w:sz="2" w:space="0" w:color="808080"/>
               <w:bottom w:val="single" w:sz="2" w:space="0" w:color="808080"/>
@@ -15057,7 +15052,7 @@
         </w:tc>
         <w:tc>
           <w:tcPr>
-            <w:tcW w:w="2521" w:type="dxa"/>
+            <w:tcW w:w="2894" w:type="dxa"/>
             <w:tcBorders>
               <w:left w:val="single" w:sz="2" w:space="0" w:color="808080"/>
               <w:bottom w:val="single" w:sz="2" w:space="0" w:color="808080"/>
@@ -15082,7 +15077,7 @@
         </w:tc>
         <w:tc>
           <w:tcPr>
-            <w:tcW w:w="1618" w:type="dxa"/>
+            <w:tcW w:w="1445" w:type="dxa"/>
             <w:tcBorders>
               <w:left w:val="single" w:sz="2" w:space="0" w:color="808080"/>
               <w:bottom w:val="single" w:sz="2" w:space="0" w:color="808080"/>
@@ -15107,7 +15102,7 @@
         </w:tc>
         <w:tc>
           <w:tcPr>
-            <w:tcW w:w="1259" w:type="dxa"/>
+            <w:tcW w:w="1202" w:type="dxa"/>
             <w:tcBorders>
               <w:left w:val="single" w:sz="2" w:space="0" w:color="808080"/>
               <w:bottom w:val="single" w:sz="2" w:space="0" w:color="808080"/>
@@ -15135,7 +15130,7 @@
         <w:trPr/>
         <w:tc>
           <w:tcPr>
-            <w:tcW w:w="513" w:type="dxa"/>
+            <w:tcW w:w="495" w:type="dxa"/>
             <w:tcBorders>
               <w:left w:val="single" w:sz="6" w:space="0" w:color="808080"/>
               <w:bottom w:val="single" w:sz="2" w:space="0" w:color="808080"/>
@@ -15160,7 +15155,7 @@
         </w:tc>
         <w:tc>
           <w:tcPr>
-            <w:tcW w:w="1351" w:type="dxa"/>
+            <w:tcW w:w="1337" w:type="dxa"/>
             <w:tcBorders>
               <w:left w:val="single" w:sz="2" w:space="0" w:color="808080"/>
               <w:bottom w:val="single" w:sz="2" w:space="0" w:color="808080"/>
@@ -15185,26 +15180,26 @@
         </w:tc>
         <w:tc>
           <w:tcPr>
-            <w:tcW w:w="2943" w:type="dxa"/>
-            <w:tcBorders>
-              <w:left w:val="single" w:sz="2" w:space="0" w:color="808080"/>
-              <w:bottom w:val="single" w:sz="2" w:space="0" w:color="808080"/>
-              <w:right w:val="single" w:sz="6" w:space="0" w:color="808080"/>
-            </w:tcBorders>
-            <w:vAlign w:val="center"/>
-          </w:tcPr>
-          <w:p>
-            <w:pPr>
-              <w:pStyle w:val="TableContents"/>
-              <w:widowControl w:val="false"/>
-              <w:suppressLineNumbers/>
-              <w:bidi w:val="0"/>
-              <w:jc w:val="left"/>
-              <w:rPr/>
-            </w:pPr>
-            <w:r>
-              <w:rPr/>
-              <w:t xml:space="preserve">Team design: </w:t>
+            <w:tcW w:w="2832" w:type="dxa"/>
+            <w:tcBorders>
+              <w:left w:val="single" w:sz="2" w:space="0" w:color="808080"/>
+              <w:bottom w:val="single" w:sz="2" w:space="0" w:color="808080"/>
+              <w:right w:val="single" w:sz="6" w:space="0" w:color="808080"/>
+            </w:tcBorders>
+            <w:vAlign w:val="center"/>
+          </w:tcPr>
+          <w:p>
+            <w:pPr>
+              <w:pStyle w:val="TableContents"/>
+              <w:widowControl w:val="false"/>
+              <w:suppressLineNumbers/>
+              <w:bidi w:val="0"/>
+              <w:jc w:val="left"/>
+              <w:rPr/>
+            </w:pPr>
+            <w:r>
+              <w:rPr/>
+              <w:t xml:space="preserve">The author's design: </w:t>
             </w:r>
             <w:r>
               <w:rPr>
@@ -15214,7 +15209,7 @@
             </w:r>
             <w:r>
               <w:rPr/>
-              <w:t xml:space="preserve">; team wrote </w:t>
+              <w:t xml:space="preserve">; the author wrote </w:t>
             </w:r>
             <w:r>
               <w:rPr>
@@ -15236,26 +15231,26 @@
         </w:tc>
         <w:tc>
           <w:tcPr>
-            <w:tcW w:w="2521" w:type="dxa"/>
-            <w:tcBorders>
-              <w:left w:val="single" w:sz="2" w:space="0" w:color="808080"/>
-              <w:bottom w:val="single" w:sz="2" w:space="0" w:color="808080"/>
-              <w:right w:val="single" w:sz="6" w:space="0" w:color="808080"/>
-            </w:tcBorders>
-            <w:vAlign w:val="center"/>
-          </w:tcPr>
-          <w:p>
-            <w:pPr>
-              <w:pStyle w:val="TableContents"/>
-              <w:widowControl w:val="false"/>
-              <w:suppressLineNumbers/>
-              <w:bidi w:val="0"/>
-              <w:jc w:val="left"/>
-              <w:rPr/>
-            </w:pPr>
-            <w:r>
-              <w:rPr/>
-              <w:t xml:space="preserve">Added the team's files unchanged; wrote </w:t>
+            <w:tcW w:w="2894" w:type="dxa"/>
+            <w:tcBorders>
+              <w:left w:val="single" w:sz="2" w:space="0" w:color="808080"/>
+              <w:bottom w:val="single" w:sz="2" w:space="0" w:color="808080"/>
+              <w:right w:val="single" w:sz="6" w:space="0" w:color="808080"/>
+            </w:tcBorders>
+            <w:vAlign w:val="center"/>
+          </w:tcPr>
+          <w:p>
+            <w:pPr>
+              <w:pStyle w:val="TableContents"/>
+              <w:widowControl w:val="false"/>
+              <w:suppressLineNumbers/>
+              <w:bidi w:val="0"/>
+              <w:jc w:val="left"/>
+              <w:rPr/>
+            </w:pPr>
+            <w:r>
+              <w:rPr/>
+              <w:t xml:space="preserve">Added the author's files unchanged; wrote </w:t>
             </w:r>
             <w:r>
               <w:rPr>
@@ -15265,13 +15260,13 @@
             </w:r>
             <w:r>
               <w:rPr/>
-              <w:t xml:space="preserve"> to the factory's API; tested with a fake server; merged the team's Stage 1 merge into its branch</w:t>
-            </w:r>
-          </w:p>
-        </w:tc>
-        <w:tc>
-          <w:tcPr>
-            <w:tcW w:w="1618" w:type="dxa"/>
+              <w:t xml:space="preserve"> to the factory's API; tested with a fake server; merged the author's Stage 1 merge into its branch</w:t>
+            </w:r>
+          </w:p>
+        </w:tc>
+        <w:tc>
+          <w:tcPr>
+            <w:tcW w:w="1445" w:type="dxa"/>
             <w:tcBorders>
               <w:left w:val="single" w:sz="2" w:space="0" w:color="808080"/>
               <w:bottom w:val="single" w:sz="2" w:space="0" w:color="808080"/>
@@ -15302,7 +15297,7 @@
         </w:tc>
         <w:tc>
           <w:tcPr>
-            <w:tcW w:w="1259" w:type="dxa"/>
+            <w:tcW w:w="1202" w:type="dxa"/>
             <w:tcBorders>
               <w:left w:val="single" w:sz="2" w:space="0" w:color="808080"/>
               <w:bottom w:val="single" w:sz="2" w:space="0" w:color="808080"/>
@@ -15340,7 +15335,7 @@
         <w:trPr/>
         <w:tc>
           <w:tcPr>
-            <w:tcW w:w="513" w:type="dxa"/>
+            <w:tcW w:w="495" w:type="dxa"/>
             <w:tcBorders>
               <w:left w:val="single" w:sz="6" w:space="0" w:color="808080"/>
               <w:bottom w:val="single" w:sz="2" w:space="0" w:color="808080"/>
@@ -15365,7 +15360,7 @@
         </w:tc>
         <w:tc>
           <w:tcPr>
-            <w:tcW w:w="1351" w:type="dxa"/>
+            <w:tcW w:w="1337" w:type="dxa"/>
             <w:tcBorders>
               <w:left w:val="single" w:sz="2" w:space="0" w:color="808080"/>
               <w:bottom w:val="single" w:sz="2" w:space="0" w:color="808080"/>
@@ -15390,7 +15385,7 @@
         </w:tc>
         <w:tc>
           <w:tcPr>
-            <w:tcW w:w="2943" w:type="dxa"/>
+            <w:tcW w:w="2832" w:type="dxa"/>
             <w:tcBorders>
               <w:left w:val="single" w:sz="2" w:space="0" w:color="808080"/>
               <w:bottom w:val="single" w:sz="2" w:space="0" w:color="808080"/>
@@ -15415,7 +15410,7 @@
         </w:tc>
         <w:tc>
           <w:tcPr>
-            <w:tcW w:w="2521" w:type="dxa"/>
+            <w:tcW w:w="2894" w:type="dxa"/>
             <w:tcBorders>
               <w:left w:val="single" w:sz="2" w:space="0" w:color="808080"/>
               <w:bottom w:val="single" w:sz="2" w:space="0" w:color="808080"/>
@@ -15456,7 +15451,7 @@
         </w:tc>
         <w:tc>
           <w:tcPr>
-            <w:tcW w:w="1618" w:type="dxa"/>
+            <w:tcW w:w="1445" w:type="dxa"/>
             <w:tcBorders>
               <w:left w:val="single" w:sz="2" w:space="0" w:color="808080"/>
               <w:bottom w:val="single" w:sz="2" w:space="0" w:color="808080"/>
@@ -15481,7 +15476,7 @@
         </w:tc>
         <w:tc>
           <w:tcPr>
-            <w:tcW w:w="1259" w:type="dxa"/>
+            <w:tcW w:w="1202" w:type="dxa"/>
             <w:tcBorders>
               <w:left w:val="single" w:sz="2" w:space="0" w:color="808080"/>
               <w:bottom w:val="single" w:sz="2" w:space="0" w:color="808080"/>
@@ -15519,7 +15514,7 @@
         <w:trPr/>
         <w:tc>
           <w:tcPr>
-            <w:tcW w:w="513" w:type="dxa"/>
+            <w:tcW w:w="495" w:type="dxa"/>
             <w:tcBorders>
               <w:left w:val="single" w:sz="6" w:space="0" w:color="808080"/>
               <w:bottom w:val="single" w:sz="2" w:space="0" w:color="808080"/>
@@ -15544,7 +15539,7 @@
         </w:tc>
         <w:tc>
           <w:tcPr>
-            <w:tcW w:w="1351" w:type="dxa"/>
+            <w:tcW w:w="1337" w:type="dxa"/>
             <w:tcBorders>
               <w:left w:val="single" w:sz="2" w:space="0" w:color="808080"/>
               <w:bottom w:val="single" w:sz="2" w:space="0" w:color="808080"/>
@@ -15569,7 +15564,7 @@
         </w:tc>
         <w:tc>
           <w:tcPr>
-            <w:tcW w:w="2943" w:type="dxa"/>
+            <w:tcW w:w="2832" w:type="dxa"/>
             <w:tcBorders>
               <w:left w:val="single" w:sz="2" w:space="0" w:color="808080"/>
               <w:bottom w:val="single" w:sz="2" w:space="0" w:color="808080"/>
@@ -15594,7 +15589,7 @@
         </w:tc>
         <w:tc>
           <w:tcPr>
-            <w:tcW w:w="2521" w:type="dxa"/>
+            <w:tcW w:w="2894" w:type="dxa"/>
             <w:tcBorders>
               <w:left w:val="single" w:sz="2" w:space="0" w:color="808080"/>
               <w:bottom w:val="single" w:sz="2" w:space="0" w:color="808080"/>
@@ -15635,7 +15630,7 @@
         </w:tc>
         <w:tc>
           <w:tcPr>
-            <w:tcW w:w="1618" w:type="dxa"/>
+            <w:tcW w:w="1445" w:type="dxa"/>
             <w:tcBorders>
               <w:left w:val="single" w:sz="2" w:space="0" w:color="808080"/>
               <w:bottom w:val="single" w:sz="2" w:space="0" w:color="808080"/>
@@ -15666,7 +15661,7 @@
         </w:tc>
         <w:tc>
           <w:tcPr>
-            <w:tcW w:w="1259" w:type="dxa"/>
+            <w:tcW w:w="1202" w:type="dxa"/>
             <w:tcBorders>
               <w:left w:val="single" w:sz="2" w:space="0" w:color="808080"/>
               <w:bottom w:val="single" w:sz="2" w:space="0" w:color="808080"/>
@@ -15714,7 +15709,7 @@
         <w:trPr/>
         <w:tc>
           <w:tcPr>
-            <w:tcW w:w="513" w:type="dxa"/>
+            <w:tcW w:w="495" w:type="dxa"/>
             <w:tcBorders>
               <w:left w:val="single" w:sz="6" w:space="0" w:color="808080"/>
               <w:bottom w:val="single" w:sz="2" w:space="0" w:color="808080"/>
@@ -15739,7 +15734,7 @@
         </w:tc>
         <w:tc>
           <w:tcPr>
-            <w:tcW w:w="1351" w:type="dxa"/>
+            <w:tcW w:w="1337" w:type="dxa"/>
             <w:tcBorders>
               <w:left w:val="single" w:sz="2" w:space="0" w:color="808080"/>
               <w:bottom w:val="single" w:sz="2" w:space="0" w:color="808080"/>
@@ -15764,7 +15759,7 @@
         </w:tc>
         <w:tc>
           <w:tcPr>
-            <w:tcW w:w="2943" w:type="dxa"/>
+            <w:tcW w:w="2832" w:type="dxa"/>
             <w:tcBorders>
               <w:left w:val="single" w:sz="2" w:space="0" w:color="808080"/>
               <w:bottom w:val="single" w:sz="2" w:space="0" w:color="808080"/>
@@ -15789,7 +15784,7 @@
         </w:tc>
         <w:tc>
           <w:tcPr>
-            <w:tcW w:w="2521" w:type="dxa"/>
+            <w:tcW w:w="2894" w:type="dxa"/>
             <w:tcBorders>
               <w:left w:val="single" w:sz="2" w:space="0" w:color="808080"/>
               <w:bottom w:val="single" w:sz="2" w:space="0" w:color="808080"/>
@@ -15814,7 +15809,7 @@
         </w:tc>
         <w:tc>
           <w:tcPr>
-            <w:tcW w:w="1618" w:type="dxa"/>
+            <w:tcW w:w="1445" w:type="dxa"/>
             <w:tcBorders>
               <w:left w:val="single" w:sz="2" w:space="0" w:color="808080"/>
               <w:bottom w:val="single" w:sz="2" w:space="0" w:color="808080"/>
@@ -15859,7 +15854,7 @@
         </w:tc>
         <w:tc>
           <w:tcPr>
-            <w:tcW w:w="1259" w:type="dxa"/>
+            <w:tcW w:w="1202" w:type="dxa"/>
             <w:tcBorders>
               <w:left w:val="single" w:sz="2" w:space="0" w:color="808080"/>
               <w:bottom w:val="single" w:sz="2" w:space="0" w:color="808080"/>
@@ -15887,7 +15882,7 @@
         <w:trPr/>
         <w:tc>
           <w:tcPr>
-            <w:tcW w:w="513" w:type="dxa"/>
+            <w:tcW w:w="495" w:type="dxa"/>
             <w:tcBorders>
               <w:left w:val="single" w:sz="6" w:space="0" w:color="808080"/>
               <w:bottom w:val="single" w:sz="2" w:space="0" w:color="808080"/>
@@ -15912,7 +15907,7 @@
         </w:tc>
         <w:tc>
           <w:tcPr>
-            <w:tcW w:w="1351" w:type="dxa"/>
+            <w:tcW w:w="1337" w:type="dxa"/>
             <w:tcBorders>
               <w:left w:val="single" w:sz="2" w:space="0" w:color="808080"/>
               <w:bottom w:val="single" w:sz="2" w:space="0" w:color="808080"/>
@@ -15937,7 +15932,7 @@
         </w:tc>
         <w:tc>
           <w:tcPr>
-            <w:tcW w:w="2943" w:type="dxa"/>
+            <w:tcW w:w="2832" w:type="dxa"/>
             <w:tcBorders>
               <w:left w:val="single" w:sz="2" w:space="0" w:color="808080"/>
               <w:bottom w:val="single" w:sz="2" w:space="0" w:color="808080"/>
@@ -15962,7 +15957,7 @@
         </w:tc>
         <w:tc>
           <w:tcPr>
-            <w:tcW w:w="2521" w:type="dxa"/>
+            <w:tcW w:w="2894" w:type="dxa"/>
             <w:tcBorders>
               <w:left w:val="single" w:sz="2" w:space="0" w:color="808080"/>
               <w:bottom w:val="single" w:sz="2" w:space="0" w:color="808080"/>
@@ -15987,7 +15982,7 @@
         </w:tc>
         <w:tc>
           <w:tcPr>
-            <w:tcW w:w="1618" w:type="dxa"/>
+            <w:tcW w:w="1445" w:type="dxa"/>
             <w:tcBorders>
               <w:left w:val="single" w:sz="2" w:space="0" w:color="808080"/>
               <w:bottom w:val="single" w:sz="2" w:space="0" w:color="808080"/>
@@ -16018,7 +16013,7 @@
         </w:tc>
         <w:tc>
           <w:tcPr>
-            <w:tcW w:w="1259" w:type="dxa"/>
+            <w:tcW w:w="1202" w:type="dxa"/>
             <w:tcBorders>
               <w:left w:val="single" w:sz="2" w:space="0" w:color="808080"/>
               <w:bottom w:val="single" w:sz="2" w:space="0" w:color="808080"/>
@@ -16076,7 +16071,7 @@
         <w:trPr/>
         <w:tc>
           <w:tcPr>
-            <w:tcW w:w="513" w:type="dxa"/>
+            <w:tcW w:w="495" w:type="dxa"/>
             <w:tcBorders>
               <w:left w:val="single" w:sz="6" w:space="0" w:color="808080"/>
               <w:bottom w:val="single" w:sz="2" w:space="0" w:color="808080"/>
@@ -16101,7 +16096,7 @@
         </w:tc>
         <w:tc>
           <w:tcPr>
-            <w:tcW w:w="1351" w:type="dxa"/>
+            <w:tcW w:w="1337" w:type="dxa"/>
             <w:tcBorders>
               <w:left w:val="single" w:sz="2" w:space="0" w:color="808080"/>
               <w:bottom w:val="single" w:sz="2" w:space="0" w:color="808080"/>
@@ -16126,7 +16121,7 @@
         </w:tc>
         <w:tc>
           <w:tcPr>
-            <w:tcW w:w="2943" w:type="dxa"/>
+            <w:tcW w:w="2832" w:type="dxa"/>
             <w:tcBorders>
               <w:left w:val="single" w:sz="2" w:space="0" w:color="808080"/>
               <w:bottom w:val="single" w:sz="2" w:space="0" w:color="808080"/>
@@ -16151,7 +16146,7 @@
         </w:tc>
         <w:tc>
           <w:tcPr>
-            <w:tcW w:w="2521" w:type="dxa"/>
+            <w:tcW w:w="2894" w:type="dxa"/>
             <w:tcBorders>
               <w:left w:val="single" w:sz="2" w:space="0" w:color="808080"/>
               <w:bottom w:val="single" w:sz="2" w:space="0" w:color="808080"/>
@@ -16176,7 +16171,7 @@
         </w:tc>
         <w:tc>
           <w:tcPr>
-            <w:tcW w:w="1618" w:type="dxa"/>
+            <w:tcW w:w="1445" w:type="dxa"/>
             <w:tcBorders>
               <w:left w:val="single" w:sz="2" w:space="0" w:color="808080"/>
               <w:bottom w:val="single" w:sz="2" w:space="0" w:color="808080"/>
@@ -16201,7 +16196,7 @@
         </w:tc>
         <w:tc>
           <w:tcPr>
-            <w:tcW w:w="1259" w:type="dxa"/>
+            <w:tcW w:w="1202" w:type="dxa"/>
             <w:tcBorders>
               <w:left w:val="single" w:sz="2" w:space="0" w:color="808080"/>
               <w:bottom w:val="single" w:sz="2" w:space="0" w:color="808080"/>
@@ -16269,7 +16264,7 @@
         <w:trPr/>
         <w:tc>
           <w:tcPr>
-            <w:tcW w:w="513" w:type="dxa"/>
+            <w:tcW w:w="495" w:type="dxa"/>
             <w:tcBorders>
               <w:left w:val="single" w:sz="6" w:space="0" w:color="808080"/>
               <w:bottom w:val="single" w:sz="2" w:space="0" w:color="808080"/>
@@ -16294,7 +16289,7 @@
         </w:tc>
         <w:tc>
           <w:tcPr>
-            <w:tcW w:w="1351" w:type="dxa"/>
+            <w:tcW w:w="1337" w:type="dxa"/>
             <w:tcBorders>
               <w:left w:val="single" w:sz="2" w:space="0" w:color="808080"/>
               <w:bottom w:val="single" w:sz="2" w:space="0" w:color="808080"/>
@@ -16319,7 +16314,7 @@
         </w:tc>
         <w:tc>
           <w:tcPr>
-            <w:tcW w:w="2943" w:type="dxa"/>
+            <w:tcW w:w="2832" w:type="dxa"/>
             <w:tcBorders>
               <w:left w:val="single" w:sz="2" w:space="0" w:color="808080"/>
               <w:bottom w:val="single" w:sz="2" w:space="0" w:color="808080"/>
@@ -16344,7 +16339,7 @@
         </w:tc>
         <w:tc>
           <w:tcPr>
-            <w:tcW w:w="2521" w:type="dxa"/>
+            <w:tcW w:w="2894" w:type="dxa"/>
             <w:tcBorders>
               <w:left w:val="single" w:sz="2" w:space="0" w:color="808080"/>
               <w:bottom w:val="single" w:sz="2" w:space="0" w:color="808080"/>
@@ -16369,7 +16364,7 @@
         </w:tc>
         <w:tc>
           <w:tcPr>
-            <w:tcW w:w="1618" w:type="dxa"/>
+            <w:tcW w:w="1445" w:type="dxa"/>
             <w:tcBorders>
               <w:left w:val="single" w:sz="2" w:space="0" w:color="808080"/>
               <w:bottom w:val="single" w:sz="2" w:space="0" w:color="808080"/>
@@ -16394,7 +16389,7 @@
         </w:tc>
         <w:tc>
           <w:tcPr>
-            <w:tcW w:w="1259" w:type="dxa"/>
+            <w:tcW w:w="1202" w:type="dxa"/>
             <w:tcBorders>
               <w:left w:val="single" w:sz="2" w:space="0" w:color="808080"/>
               <w:bottom w:val="single" w:sz="2" w:space="0" w:color="808080"/>
@@ -16432,7 +16427,7 @@
         <w:trPr/>
         <w:tc>
           <w:tcPr>
-            <w:tcW w:w="513" w:type="dxa"/>
+            <w:tcW w:w="495" w:type="dxa"/>
             <w:tcBorders>
               <w:left w:val="single" w:sz="6" w:space="0" w:color="808080"/>
               <w:bottom w:val="single" w:sz="2" w:space="0" w:color="808080"/>
@@ -16457,7 +16452,7 @@
         </w:tc>
         <w:tc>
           <w:tcPr>
-            <w:tcW w:w="1351" w:type="dxa"/>
+            <w:tcW w:w="1337" w:type="dxa"/>
             <w:tcBorders>
               <w:left w:val="single" w:sz="2" w:space="0" w:color="808080"/>
               <w:bottom w:val="single" w:sz="2" w:space="0" w:color="808080"/>
@@ -16482,7 +16477,7 @@
         </w:tc>
         <w:tc>
           <w:tcPr>
-            <w:tcW w:w="2943" w:type="dxa"/>
+            <w:tcW w:w="2832" w:type="dxa"/>
             <w:tcBorders>
               <w:left w:val="single" w:sz="2" w:space="0" w:color="808080"/>
               <w:bottom w:val="single" w:sz="2" w:space="0" w:color="808080"/>
@@ -16507,7 +16502,7 @@
         </w:tc>
         <w:tc>
           <w:tcPr>
-            <w:tcW w:w="2521" w:type="dxa"/>
+            <w:tcW w:w="2894" w:type="dxa"/>
             <w:tcBorders>
               <w:left w:val="single" w:sz="2" w:space="0" w:color="808080"/>
               <w:bottom w:val="single" w:sz="2" w:space="0" w:color="808080"/>
@@ -16552,59 +16547,61 @@
         </w:tc>
         <w:tc>
           <w:tcPr>
-            <w:tcW w:w="1618" w:type="dxa"/>
-            <w:tcBorders>
-              <w:left w:val="single" w:sz="2" w:space="0" w:color="808080"/>
-              <w:bottom w:val="single" w:sz="2" w:space="0" w:color="808080"/>
-              <w:right w:val="single" w:sz="6" w:space="0" w:color="808080"/>
-            </w:tcBorders>
-            <w:vAlign w:val="center"/>
-          </w:tcPr>
-          <w:p>
-            <w:pPr>
-              <w:pStyle w:val="TableContents"/>
-              <w:widowControl w:val="false"/>
-              <w:suppressLineNumbers/>
-              <w:bidi w:val="0"/>
-              <w:jc w:val="left"/>
-              <w:rPr/>
-            </w:pPr>
-            <w:r>
-              <w:rPr>
-                <w:rStyle w:val="Strong"/>
-              </w:rPr>
-              <w:t>[Team]</w:t>
-            </w:r>
-            <w:r>
-              <w:rPr/>
-              <w:t xml:space="preserve"> applied the fix (A7) on a fix branch and recorded the videos</w:t>
-            </w:r>
-          </w:p>
-        </w:tc>
-        <w:tc>
-          <w:tcPr>
-            <w:tcW w:w="1259" w:type="dxa"/>
-            <w:tcBorders>
-              <w:left w:val="single" w:sz="2" w:space="0" w:color="808080"/>
-              <w:bottom w:val="single" w:sz="2" w:space="0" w:color="808080"/>
-              <w:right w:val="single" w:sz="6" w:space="0" w:color="808080"/>
-            </w:tcBorders>
-            <w:vAlign w:val="center"/>
-          </w:tcPr>
-          <w:p>
-            <w:pPr>
-              <w:pStyle w:val="TableContents"/>
-              <w:widowControl w:val="false"/>
-              <w:suppressLineNumbers/>
-              <w:bidi w:val="0"/>
-              <w:jc w:val="left"/>
-              <w:rPr/>
-            </w:pPr>
-            <w:r>
-              <w:rPr>
-                <w:rStyle w:val="Strong"/>
-              </w:rPr>
-              <w:t>[Team]</w:t>
+            <w:tcW w:w="1445" w:type="dxa"/>
+            <w:tcBorders>
+              <w:left w:val="single" w:sz="2" w:space="0" w:color="808080"/>
+              <w:bottom w:val="single" w:sz="2" w:space="0" w:color="808080"/>
+              <w:right w:val="single" w:sz="6" w:space="0" w:color="808080"/>
+            </w:tcBorders>
+            <w:vAlign w:val="center"/>
+          </w:tcPr>
+          <w:p>
+            <w:pPr>
+              <w:pStyle w:val="TableContents"/>
+              <w:widowControl w:val="false"/>
+              <w:suppressLineNumbers/>
+              <w:bidi w:val="0"/>
+              <w:jc w:val="left"/>
+              <w:rPr/>
+            </w:pPr>
+            <w:r>
+              <w:rPr/>
+              <w:t>Applied the A7 fix and committed it</w:t>
+            </w:r>
+          </w:p>
+        </w:tc>
+        <w:tc>
+          <w:tcPr>
+            <w:tcW w:w="1202" w:type="dxa"/>
+            <w:tcBorders>
+              <w:left w:val="single" w:sz="2" w:space="0" w:color="808080"/>
+              <w:bottom w:val="single" w:sz="2" w:space="0" w:color="808080"/>
+              <w:right w:val="single" w:sz="6" w:space="0" w:color="808080"/>
+            </w:tcBorders>
+            <w:vAlign w:val="center"/>
+          </w:tcPr>
+          <w:p>
+            <w:pPr>
+              <w:pStyle w:val="TableContents"/>
+              <w:widowControl w:val="false"/>
+              <w:suppressLineNumbers/>
+              <w:bidi w:val="0"/>
+              <w:jc w:val="left"/>
+              <w:rPr/>
+            </w:pPr>
+            <w:r>
+              <w:rPr/>
+              <w:t>Incorporated (</w:t>
+            </w:r>
+            <w:r>
+              <w:rPr>
+                <w:rStyle w:val="SourceText"/>
+              </w:rPr>
+              <w:t>f8fe10f</w:t>
+            </w:r>
+            <w:r>
+              <w:rPr/>
+              <w:t>)</w:t>
             </w:r>
           </w:p>
         </w:tc>
@@ -16613,7 +16610,7 @@
         <w:trPr/>
         <w:tc>
           <w:tcPr>
-            <w:tcW w:w="513" w:type="dxa"/>
+            <w:tcW w:w="495" w:type="dxa"/>
             <w:tcBorders>
               <w:left w:val="single" w:sz="6" w:space="0" w:color="808080"/>
               <w:bottom w:val="single" w:sz="6" w:space="0" w:color="808080"/>
@@ -16632,13 +16629,13 @@
             </w:pPr>
             <w:r>
               <w:rPr/>
-              <w:t>CL-15+</w:t>
-            </w:r>
-          </w:p>
-        </w:tc>
-        <w:tc>
-          <w:tcPr>
-            <w:tcW w:w="1351" w:type="dxa"/>
+              <w:t>CL-15 (29 Oct)</w:t>
+            </w:r>
+          </w:p>
+        </w:tc>
+        <w:tc>
+          <w:tcPr>
+            <w:tcW w:w="1337" w:type="dxa"/>
             <w:tcBorders>
               <w:left w:val="single" w:sz="2" w:space="0" w:color="808080"/>
               <w:bottom w:val="single" w:sz="6" w:space="0" w:color="808080"/>
@@ -16656,16 +16653,14 @@
               <w:rPr/>
             </w:pPr>
             <w:r>
-              <w:rPr>
-                <w:rStyle w:val="Strong"/>
-              </w:rPr>
-              <w:t>[Team]</w:t>
-            </w:r>
-          </w:p>
-        </w:tc>
-        <w:tc>
-          <w:tcPr>
-            <w:tcW w:w="2943" w:type="dxa"/>
+              <w:rPr/>
+              <w:t>A bug found by the author</w:t>
+            </w:r>
+          </w:p>
+        </w:tc>
+        <w:tc>
+          <w:tcPr>
+            <w:tcW w:w="2832" w:type="dxa"/>
             <w:tcBorders>
               <w:left w:val="single" w:sz="2" w:space="0" w:color="808080"/>
               <w:bottom w:val="single" w:sz="6" w:space="0" w:color="808080"/>
@@ -16676,24 +16671,21 @@
           <w:p>
             <w:pPr>
               <w:pStyle w:val="TableContents"/>
-              <w:bidi w:val="0"/>
-              <w:jc w:val="left"/>
-              <w:rPr>
-                <w:sz w:val="4"/>
-                <w:szCs w:val="4"/>
-              </w:rPr>
-            </w:pPr>
-            <w:r>
-              <w:rPr>
-                <w:sz w:val="4"/>
-                <w:szCs w:val="4"/>
-              </w:rPr>
-            </w:r>
-          </w:p>
-        </w:tc>
-        <w:tc>
-          <w:tcPr>
-            <w:tcW w:w="2521" w:type="dxa"/>
+              <w:widowControl w:val="false"/>
+              <w:suppressLineNumbers/>
+              <w:bidi w:val="0"/>
+              <w:jc w:val="left"/>
+              <w:rPr/>
+            </w:pPr>
+            <w:r>
+              <w:rPr/>
+              <w:t>"Give me dinner for 9.5 days gives me a 5 day dinner"; then "round down or up whichever is closer"</w:t>
+            </w:r>
+          </w:p>
+        </w:tc>
+        <w:tc>
+          <w:tcPr>
+            <w:tcW w:w="2894" w:type="dxa"/>
             <w:tcBorders>
               <w:left w:val="single" w:sz="2" w:space="0" w:color="808080"/>
               <w:bottom w:val="single" w:sz="6" w:space="0" w:color="808080"/>
@@ -16704,24 +16696,31 @@
           <w:p>
             <w:pPr>
               <w:pStyle w:val="TableContents"/>
-              <w:bidi w:val="0"/>
-              <w:jc w:val="left"/>
-              <w:rPr>
-                <w:sz w:val="4"/>
-                <w:szCs w:val="4"/>
-              </w:rPr>
-            </w:pPr>
-            <w:r>
-              <w:rPr>
-                <w:sz w:val="4"/>
-                <w:szCs w:val="4"/>
-              </w:rPr>
-            </w:r>
-          </w:p>
-        </w:tc>
-        <w:tc>
-          <w:tcPr>
-            <w:tcW w:w="1618" w:type="dxa"/>
+              <w:widowControl w:val="false"/>
+              <w:suppressLineNumbers/>
+              <w:bidi w:val="0"/>
+              <w:jc w:val="left"/>
+              <w:rPr/>
+            </w:pPr>
+            <w:r>
+              <w:rPr/>
+              <w:t xml:space="preserve">Traced it to the number patterns (other decimals were also misread or ignored); implemented the rounding rule with two tests on </w:t>
+            </w:r>
+            <w:r>
+              <w:rPr>
+                <w:rStyle w:val="SourceText"/>
+              </w:rPr>
+              <w:t>fix/decimalNumbersInRequests</w:t>
+            </w:r>
+            <w:r>
+              <w:rPr/>
+              <w:t>; committed and pushed at the author's request</w:t>
+            </w:r>
+          </w:p>
+        </w:tc>
+        <w:tc>
+          <w:tcPr>
+            <w:tcW w:w="1445" w:type="dxa"/>
             <w:tcBorders>
               <w:left w:val="single" w:sz="2" w:space="0" w:color="808080"/>
               <w:bottom w:val="single" w:sz="6" w:space="0" w:color="808080"/>
@@ -16732,24 +16731,21 @@
           <w:p>
             <w:pPr>
               <w:pStyle w:val="TableContents"/>
-              <w:bidi w:val="0"/>
-              <w:jc w:val="left"/>
-              <w:rPr>
-                <w:sz w:val="4"/>
-                <w:szCs w:val="4"/>
-              </w:rPr>
-            </w:pPr>
-            <w:r>
-              <w:rPr>
-                <w:sz w:val="4"/>
-                <w:szCs w:val="4"/>
-              </w:rPr>
-            </w:r>
-          </w:p>
-        </w:tc>
-        <w:tc>
-          <w:tcPr>
-            <w:tcW w:w="1259" w:type="dxa"/>
+              <w:widowControl w:val="false"/>
+              <w:suppressLineNumbers/>
+              <w:bidi w:val="0"/>
+              <w:jc w:val="left"/>
+              <w:rPr/>
+            </w:pPr>
+            <w:r>
+              <w:rPr/>
+              <w:t>Found the bug; chose the rounding behaviour; reviewed and merged the branch (PR #10)</w:t>
+            </w:r>
+          </w:p>
+        </w:tc>
+        <w:tc>
+          <w:tcPr>
+            <w:tcW w:w="1202" w:type="dxa"/>
             <w:tcBorders>
               <w:left w:val="single" w:sz="2" w:space="0" w:color="808080"/>
               <w:bottom w:val="single" w:sz="6" w:space="0" w:color="808080"/>
@@ -16760,18 +16756,25 @@
           <w:p>
             <w:pPr>
               <w:pStyle w:val="TableContents"/>
-              <w:bidi w:val="0"/>
-              <w:jc w:val="left"/>
-              <w:rPr>
-                <w:sz w:val="4"/>
-                <w:szCs w:val="4"/>
-              </w:rPr>
-            </w:pPr>
-            <w:r>
-              <w:rPr>
-                <w:sz w:val="4"/>
-                <w:szCs w:val="4"/>
-              </w:rPr>
+              <w:widowControl w:val="false"/>
+              <w:suppressLineNumbers/>
+              <w:bidi w:val="0"/>
+              <w:jc w:val="left"/>
+              <w:rPr/>
+            </w:pPr>
+            <w:r>
+              <w:rPr/>
+              <w:t>Incorporated (</w:t>
+            </w:r>
+            <w:r>
+              <w:rPr>
+                <w:rStyle w:val="SourceText"/>
+              </w:rPr>
+              <w:t>c022ae4</w:t>
+            </w:r>
+            <w:r>
+              <w:rPr/>
+              <w:t>)</w:t>
             </w:r>
           </w:p>
         </w:tc>
@@ -16821,7 +16824,7 @@
       </w:pPr>
       <w:r>
         <w:rPr/>
-        <w:t xml:space="preserve">The team uses </w:t>
+        <w:t xml:space="preserve">The author uses </w:t>
       </w:r>
       <w:r>
         <w:rPr>
@@ -16883,7 +16886,7 @@
       </w:pPr>
       <w:r>
         <w:rPr/>
-        <w:t>Implementation started before the Stage 2 period (the professor was informed); the team counts total meaningful code commits across the stage.</w:t>
+        <w:t>Implementation started before the Stage 2 period (the professor was informed); the stage counts total meaningful code commits across the stage.</w:t>
       </w:r>
     </w:p>
     <w:tbl>
@@ -16900,9 +16903,9 @@
         </w:tblCellMar>
       </w:tblPr>
       <w:tblGrid>
-        <w:gridCol w:w="1355"/>
-        <w:gridCol w:w="1517"/>
-        <w:gridCol w:w="7333"/>
+        <w:gridCol w:w="1226"/>
+        <w:gridCol w:w="1393"/>
+        <w:gridCol w:w="7586"/>
       </w:tblGrid>
       <w:tr>
         <w:trPr>
@@ -16910,7 +16913,7 @@
         </w:trPr>
         <w:tc>
           <w:tcPr>
-            <w:tcW w:w="1355" w:type="dxa"/>
+            <w:tcW w:w="1226" w:type="dxa"/>
             <w:tcBorders>
               <w:top w:val="single" w:sz="6" w:space="0" w:color="808080"/>
               <w:left w:val="single" w:sz="6" w:space="0" w:color="808080"/>
@@ -16936,7 +16939,7 @@
         </w:tc>
         <w:tc>
           <w:tcPr>
-            <w:tcW w:w="1517" w:type="dxa"/>
+            <w:tcW w:w="1393" w:type="dxa"/>
             <w:tcBorders>
               <w:top w:val="single" w:sz="6" w:space="0" w:color="808080"/>
               <w:left w:val="single" w:sz="2" w:space="0" w:color="808080"/>
@@ -16962,7 +16965,7 @@
         </w:tc>
         <w:tc>
           <w:tcPr>
-            <w:tcW w:w="7333" w:type="dxa"/>
+            <w:tcW w:w="7586" w:type="dxa"/>
             <w:tcBorders>
               <w:top w:val="single" w:sz="6" w:space="0" w:color="808080"/>
               <w:left w:val="single" w:sz="2" w:space="0" w:color="808080"/>
@@ -16991,7 +16994,7 @@
         <w:trPr/>
         <w:tc>
           <w:tcPr>
-            <w:tcW w:w="1355" w:type="dxa"/>
+            <w:tcW w:w="1226" w:type="dxa"/>
             <w:tcBorders>
               <w:left w:val="single" w:sz="6" w:space="0" w:color="808080"/>
               <w:bottom w:val="single" w:sz="2" w:space="0" w:color="808080"/>
@@ -17016,7 +17019,7 @@
         </w:tc>
         <w:tc>
           <w:tcPr>
-            <w:tcW w:w="1517" w:type="dxa"/>
+            <w:tcW w:w="1393" w:type="dxa"/>
             <w:tcBorders>
               <w:left w:val="single" w:sz="2" w:space="0" w:color="808080"/>
               <w:bottom w:val="single" w:sz="2" w:space="0" w:color="808080"/>
@@ -17041,7 +17044,7 @@
         </w:tc>
         <w:tc>
           <w:tcPr>
-            <w:tcW w:w="7333" w:type="dxa"/>
+            <w:tcW w:w="7586" w:type="dxa"/>
             <w:tcBorders>
               <w:left w:val="single" w:sz="2" w:space="0" w:color="808080"/>
               <w:bottom w:val="single" w:sz="2" w:space="0" w:color="808080"/>
@@ -17171,7 +17174,7 @@
         <w:trPr/>
         <w:tc>
           <w:tcPr>
-            <w:tcW w:w="1355" w:type="dxa"/>
+            <w:tcW w:w="1226" w:type="dxa"/>
             <w:tcBorders>
               <w:left w:val="single" w:sz="6" w:space="0" w:color="808080"/>
               <w:bottom w:val="single" w:sz="2" w:space="0" w:color="808080"/>
@@ -17196,7 +17199,7 @@
         </w:tc>
         <w:tc>
           <w:tcPr>
-            <w:tcW w:w="1517" w:type="dxa"/>
+            <w:tcW w:w="1393" w:type="dxa"/>
             <w:tcBorders>
               <w:left w:val="single" w:sz="2" w:space="0" w:color="808080"/>
               <w:bottom w:val="single" w:sz="2" w:space="0" w:color="808080"/>
@@ -17221,7 +17224,7 @@
         </w:tc>
         <w:tc>
           <w:tcPr>
-            <w:tcW w:w="7333" w:type="dxa"/>
+            <w:tcW w:w="7586" w:type="dxa"/>
             <w:tcBorders>
               <w:left w:val="single" w:sz="2" w:space="0" w:color="808080"/>
               <w:bottom w:val="single" w:sz="2" w:space="0" w:color="808080"/>
@@ -17249,7 +17252,7 @@
         <w:trPr/>
         <w:tc>
           <w:tcPr>
-            <w:tcW w:w="1355" w:type="dxa"/>
+            <w:tcW w:w="1226" w:type="dxa"/>
             <w:tcBorders>
               <w:left w:val="single" w:sz="6" w:space="0" w:color="808080"/>
               <w:bottom w:val="single" w:sz="2" w:space="0" w:color="808080"/>
@@ -17274,32 +17277,32 @@
         </w:tc>
         <w:tc>
           <w:tcPr>
-            <w:tcW w:w="1517" w:type="dxa"/>
-            <w:tcBorders>
-              <w:left w:val="single" w:sz="2" w:space="0" w:color="808080"/>
-              <w:bottom w:val="single" w:sz="2" w:space="0" w:color="808080"/>
-              <w:right w:val="single" w:sz="6" w:space="0" w:color="808080"/>
-            </w:tcBorders>
-            <w:vAlign w:val="center"/>
-          </w:tcPr>
-          <w:p>
-            <w:pPr>
-              <w:pStyle w:val="TableContents"/>
-              <w:widowControl w:val="false"/>
-              <w:suppressLineNumbers/>
-              <w:bidi w:val="0"/>
-              <w:jc w:val="left"/>
-              <w:rPr/>
-            </w:pPr>
-            <w:r>
-              <w:rPr/>
-              <w:t>7 so far</w:t>
-            </w:r>
-          </w:p>
-        </w:tc>
-        <w:tc>
-          <w:tcPr>
-            <w:tcW w:w="7333" w:type="dxa"/>
+            <w:tcW w:w="1393" w:type="dxa"/>
+            <w:tcBorders>
+              <w:left w:val="single" w:sz="2" w:space="0" w:color="808080"/>
+              <w:bottom w:val="single" w:sz="2" w:space="0" w:color="808080"/>
+              <w:right w:val="single" w:sz="6" w:space="0" w:color="808080"/>
+            </w:tcBorders>
+            <w:vAlign w:val="center"/>
+          </w:tcPr>
+          <w:p>
+            <w:pPr>
+              <w:pStyle w:val="TableContents"/>
+              <w:widowControl w:val="false"/>
+              <w:suppressLineNumbers/>
+              <w:bidi w:val="0"/>
+              <w:jc w:val="left"/>
+              <w:rPr/>
+            </w:pPr>
+            <w:r>
+              <w:rPr/>
+              <w:t>9</w:t>
+            </w:r>
+          </w:p>
+        </w:tc>
+        <w:tc>
+          <w:tcPr>
+            <w:tcW w:w="7586" w:type="dxa"/>
             <w:tcBorders>
               <w:left w:val="single" w:sz="2" w:space="0" w:color="808080"/>
               <w:bottom w:val="single" w:sz="2" w:space="0" w:color="808080"/>
@@ -17426,7 +17429,39 @@
             </w:hyperlink>
             <w:r>
               <w:rPr/>
-              <w:t xml:space="preserve"> boundary tests</w:t>
+              <w:t xml:space="preserve"> boundary tests · </w:t>
+            </w:r>
+            <w:hyperlink r:id="rId19">
+              <w:r>
+                <w:rPr>
+                  <w:rStyle w:val="Hyperlink"/>
+                  <w:rFonts w:ascii="Liberation Mono;monospace" w:hAnsi="Liberation Mono;monospace" w:eastAsia="Liberation Mono;monospace" w:cs="Liberation Mono;monospace"/>
+                  <w:sz w:val="17"/>
+                  <w:sz w:val="17"/>
+                  <w:szCs w:val="17"/>
+                </w:rPr>
+                <w:t>f8fe10f</w:t>
+              </w:r>
+            </w:hyperlink>
+            <w:r>
+              <w:rPr/>
+              <w:t xml:space="preserve"> CLI undo message · </w:t>
+            </w:r>
+            <w:hyperlink r:id="rId20">
+              <w:r>
+                <w:rPr>
+                  <w:rStyle w:val="Hyperlink"/>
+                  <w:rFonts w:ascii="Liberation Mono;monospace" w:hAnsi="Liberation Mono;monospace" w:eastAsia="Liberation Mono;monospace" w:cs="Liberation Mono;monospace"/>
+                  <w:sz w:val="17"/>
+                  <w:sz w:val="17"/>
+                  <w:szCs w:val="17"/>
+                </w:rPr>
+                <w:t>c022ae4</w:t>
+              </w:r>
+            </w:hyperlink>
+            <w:r>
+              <w:rPr/>
+              <w:t xml:space="preserve"> decimal numbers in requests</w:t>
             </w:r>
           </w:p>
         </w:tc>
@@ -17435,7 +17470,7 @@
         <w:trPr/>
         <w:tc>
           <w:tcPr>
-            <w:tcW w:w="1355" w:type="dxa"/>
+            <w:tcW w:w="1226" w:type="dxa"/>
             <w:tcBorders>
               <w:left w:val="single" w:sz="6" w:space="0" w:color="808080"/>
               <w:bottom w:val="single" w:sz="2" w:space="0" w:color="808080"/>
@@ -17460,59 +17495,56 @@
         </w:tc>
         <w:tc>
           <w:tcPr>
-            <w:tcW w:w="1517" w:type="dxa"/>
-            <w:tcBorders>
-              <w:left w:val="single" w:sz="2" w:space="0" w:color="808080"/>
-              <w:bottom w:val="single" w:sz="2" w:space="0" w:color="808080"/>
-              <w:right w:val="single" w:sz="6" w:space="0" w:color="808080"/>
-            </w:tcBorders>
-            <w:vAlign w:val="center"/>
-          </w:tcPr>
-          <w:p>
-            <w:pPr>
-              <w:pStyle w:val="TableContents"/>
-              <w:widowControl w:val="false"/>
-              <w:suppressLineNumbers/>
-              <w:bidi w:val="0"/>
-              <w:jc w:val="left"/>
-              <w:rPr/>
-            </w:pPr>
-            <w:r>
-              <w:rPr>
-                <w:rStyle w:val="Strong"/>
-              </w:rPr>
-              <w:t>[Team]</w:t>
-            </w:r>
-          </w:p>
-        </w:tc>
-        <w:tc>
-          <w:tcPr>
-            <w:tcW w:w="7333" w:type="dxa"/>
-            <w:tcBorders>
-              <w:left w:val="single" w:sz="2" w:space="0" w:color="808080"/>
-              <w:bottom w:val="single" w:sz="2" w:space="0" w:color="808080"/>
-              <w:right w:val="single" w:sz="6" w:space="0" w:color="808080"/>
-            </w:tcBorders>
-            <w:vAlign w:val="center"/>
-          </w:tcPr>
-          <w:p>
-            <w:pPr>
-              <w:pStyle w:val="TableContents"/>
-              <w:widowControl w:val="false"/>
-              <w:suppressLineNumbers/>
-              <w:bidi w:val="0"/>
-              <w:jc w:val="left"/>
-              <w:rPr/>
-            </w:pPr>
-            <w:r>
-              <w:rPr>
-                <w:rStyle w:val="Strong"/>
-              </w:rPr>
-              <w:t>[Team]</w:t>
-            </w:r>
-            <w:r>
-              <w:rPr/>
-              <w:t xml:space="preserve"> add the commits made in this period</w:t>
+            <w:tcW w:w="1393" w:type="dxa"/>
+            <w:tcBorders>
+              <w:left w:val="single" w:sz="2" w:space="0" w:color="808080"/>
+              <w:bottom w:val="single" w:sz="2" w:space="0" w:color="808080"/>
+              <w:right w:val="single" w:sz="6" w:space="0" w:color="808080"/>
+            </w:tcBorders>
+            <w:vAlign w:val="center"/>
+          </w:tcPr>
+          <w:p>
+            <w:pPr>
+              <w:pStyle w:val="TableContents"/>
+              <w:widowControl w:val="false"/>
+              <w:suppressLineNumbers/>
+              <w:bidi w:val="0"/>
+              <w:jc w:val="left"/>
+              <w:rPr/>
+            </w:pPr>
+            <w:r>
+              <w:rPr>
+                <w:rStyle w:val="Emphasis"/>
+              </w:rPr>
+              <w:t>(to be added)</w:t>
+            </w:r>
+          </w:p>
+        </w:tc>
+        <w:tc>
+          <w:tcPr>
+            <w:tcW w:w="7586" w:type="dxa"/>
+            <w:tcBorders>
+              <w:left w:val="single" w:sz="2" w:space="0" w:color="808080"/>
+              <w:bottom w:val="single" w:sz="2" w:space="0" w:color="808080"/>
+              <w:right w:val="single" w:sz="6" w:space="0" w:color="808080"/>
+            </w:tcBorders>
+            <w:vAlign w:val="center"/>
+          </w:tcPr>
+          <w:p>
+            <w:pPr>
+              <w:pStyle w:val="TableContents"/>
+              <w:bidi w:val="0"/>
+              <w:jc w:val="left"/>
+              <w:rPr>
+                <w:sz w:val="4"/>
+                <w:szCs w:val="4"/>
+              </w:rPr>
+            </w:pPr>
+            <w:r>
+              <w:rPr>
+                <w:sz w:val="4"/>
+                <w:szCs w:val="4"/>
+              </w:rPr>
             </w:r>
           </w:p>
         </w:tc>
@@ -17521,7 +17553,7 @@
         <w:trPr/>
         <w:tc>
           <w:tcPr>
-            <w:tcW w:w="1355" w:type="dxa"/>
+            <w:tcW w:w="1226" w:type="dxa"/>
             <w:tcBorders>
               <w:left w:val="single" w:sz="6" w:space="0" w:color="808080"/>
               <w:bottom w:val="single" w:sz="6" w:space="0" w:color="808080"/>
@@ -17548,7 +17580,7 @@
         </w:tc>
         <w:tc>
           <w:tcPr>
-            <w:tcW w:w="1517" w:type="dxa"/>
+            <w:tcW w:w="1393" w:type="dxa"/>
             <w:tcBorders>
               <w:left w:val="single" w:sz="2" w:space="0" w:color="808080"/>
               <w:bottom w:val="single" w:sz="6" w:space="0" w:color="808080"/>
@@ -17569,13 +17601,13 @@
               <w:rPr>
                 <w:rStyle w:val="Strong"/>
               </w:rPr>
-              <w:t>13 so far</w:t>
-            </w:r>
-          </w:p>
-        </w:tc>
-        <w:tc>
-          <w:tcPr>
-            <w:tcW w:w="7333" w:type="dxa"/>
+              <w:t>15</w:t>
+            </w:r>
+          </w:p>
+        </w:tc>
+        <w:tc>
+          <w:tcPr>
+            <w:tcW w:w="7586" w:type="dxa"/>
             <w:tcBorders>
               <w:left w:val="single" w:sz="2" w:space="0" w:color="808080"/>
               <w:bottom w:val="single" w:sz="6" w:space="0" w:color="808080"/>
@@ -17609,7 +17641,17 @@
       </w:pPr>
       <w:r>
         <w:rPr/>
-        <w:t>Pull requests: #3–#9 (one per fix branch). Documentation-only commits (report, diagrams, README) are not counted.</w:t>
+        <w:t xml:space="preserve">Pull requests: #3–#10 (one per fix branch; A7 was committed directly on </w:t>
+      </w:r>
+      <w:r>
+        <w:rPr>
+          <w:rStyle w:val="SourceText"/>
+        </w:rPr>
+        <w:t>develop</w:t>
+      </w:r>
+      <w:r>
+        <w:rPr/>
+        <w:t>). Documentation-only commits (report, diagrams, README) are not counted.</w:t>
       </w:r>
     </w:p>
     <w:p>
@@ -17665,7 +17707,7 @@
         <w:rPr>
           <w:rStyle w:val="Strong"/>
         </w:rPr>
-        <w:t>129 tests, 0 failures</w:t>
+        <w:t>132 tests, 0 failures</w:t>
       </w:r>
       <w:r>
         <w:rPr/>
@@ -17697,7 +17739,7 @@
       </w:r>
       <w:r>
         <w:rPr/>
-        <w:t xml:space="preserve"> the packaged jar was run through the CLI and the GUI after each change (GUI on a virtual display, with screenshots); the team ran it on their machines with Gemini and with the local Ollama model </w:t>
+        <w:t xml:space="preserve"> the packaged jar was run through the CLI and the GUI after each change (GUI on a virtual display, with screenshots); the author ran it locally with Gemini and with the local Ollama model </w:t>
       </w:r>
       <w:r>
         <w:rPr>
@@ -17801,9 +17843,9 @@
         </w:tblCellMar>
       </w:tblPr>
       <w:tblGrid>
-        <w:gridCol w:w="2581"/>
-        <w:gridCol w:w="2013"/>
-        <w:gridCol w:w="5611"/>
+        <w:gridCol w:w="3088"/>
+        <w:gridCol w:w="1890"/>
+        <w:gridCol w:w="5227"/>
       </w:tblGrid>
       <w:tr>
         <w:trPr>
@@ -17811,7 +17853,7 @@
         </w:trPr>
         <w:tc>
           <w:tcPr>
-            <w:tcW w:w="2581" w:type="dxa"/>
+            <w:tcW w:w="3088" w:type="dxa"/>
             <w:tcBorders>
               <w:top w:val="single" w:sz="6" w:space="0" w:color="808080"/>
               <w:left w:val="single" w:sz="6" w:space="0" w:color="808080"/>
@@ -17837,7 +17879,7 @@
         </w:tc>
         <w:tc>
           <w:tcPr>
-            <w:tcW w:w="2013" w:type="dxa"/>
+            <w:tcW w:w="1890" w:type="dxa"/>
             <w:tcBorders>
               <w:top w:val="single" w:sz="6" w:space="0" w:color="808080"/>
               <w:left w:val="single" w:sz="2" w:space="0" w:color="808080"/>
@@ -17863,7 +17905,7 @@
         </w:tc>
         <w:tc>
           <w:tcPr>
-            <w:tcW w:w="5611" w:type="dxa"/>
+            <w:tcW w:w="5227" w:type="dxa"/>
             <w:tcBorders>
               <w:top w:val="single" w:sz="6" w:space="0" w:color="808080"/>
               <w:left w:val="single" w:sz="2" w:space="0" w:color="808080"/>
@@ -17892,7 +17934,7 @@
         <w:trPr/>
         <w:tc>
           <w:tcPr>
-            <w:tcW w:w="2581" w:type="dxa"/>
+            <w:tcW w:w="3088" w:type="dxa"/>
             <w:tcBorders>
               <w:left w:val="single" w:sz="6" w:space="0" w:color="808080"/>
               <w:bottom w:val="single" w:sz="2" w:space="0" w:color="808080"/>
@@ -17917,7 +17959,7 @@
         </w:tc>
         <w:tc>
           <w:tcPr>
-            <w:tcW w:w="2013" w:type="dxa"/>
+            <w:tcW w:w="1890" w:type="dxa"/>
             <w:tcBorders>
               <w:left w:val="single" w:sz="2" w:space="0" w:color="808080"/>
               <w:bottom w:val="single" w:sz="2" w:space="0" w:color="808080"/>
@@ -17942,7 +17984,7 @@
         </w:tc>
         <w:tc>
           <w:tcPr>
-            <w:tcW w:w="5611" w:type="dxa"/>
+            <w:tcW w:w="5227" w:type="dxa"/>
             <w:tcBorders>
               <w:left w:val="single" w:sz="2" w:space="0" w:color="808080"/>
               <w:bottom w:val="single" w:sz="2" w:space="0" w:color="808080"/>
@@ -17970,7 +18012,7 @@
         <w:trPr/>
         <w:tc>
           <w:tcPr>
-            <w:tcW w:w="2581" w:type="dxa"/>
+            <w:tcW w:w="3088" w:type="dxa"/>
             <w:tcBorders>
               <w:left w:val="single" w:sz="6" w:space="0" w:color="808080"/>
               <w:bottom w:val="single" w:sz="2" w:space="0" w:color="808080"/>
@@ -17995,7 +18037,7 @@
         </w:tc>
         <w:tc>
           <w:tcPr>
-            <w:tcW w:w="2013" w:type="dxa"/>
+            <w:tcW w:w="1890" w:type="dxa"/>
             <w:tcBorders>
               <w:left w:val="single" w:sz="2" w:space="0" w:color="808080"/>
               <w:bottom w:val="single" w:sz="2" w:space="0" w:color="808080"/>
@@ -18020,7 +18062,7 @@
         </w:tc>
         <w:tc>
           <w:tcPr>
-            <w:tcW w:w="5611" w:type="dxa"/>
+            <w:tcW w:w="5227" w:type="dxa"/>
             <w:tcBorders>
               <w:left w:val="single" w:sz="2" w:space="0" w:color="808080"/>
               <w:bottom w:val="single" w:sz="2" w:space="0" w:color="808080"/>
@@ -18048,7 +18090,7 @@
         <w:trPr/>
         <w:tc>
           <w:tcPr>
-            <w:tcW w:w="2581" w:type="dxa"/>
+            <w:tcW w:w="3088" w:type="dxa"/>
             <w:tcBorders>
               <w:left w:val="single" w:sz="6" w:space="0" w:color="808080"/>
               <w:bottom w:val="single" w:sz="2" w:space="0" w:color="808080"/>
@@ -18073,7 +18115,7 @@
         </w:tc>
         <w:tc>
           <w:tcPr>
-            <w:tcW w:w="2013" w:type="dxa"/>
+            <w:tcW w:w="1890" w:type="dxa"/>
             <w:tcBorders>
               <w:left w:val="single" w:sz="2" w:space="0" w:color="808080"/>
               <w:bottom w:val="single" w:sz="2" w:space="0" w:color="808080"/>
@@ -18098,7 +18140,7 @@
         </w:tc>
         <w:tc>
           <w:tcPr>
-            <w:tcW w:w="5611" w:type="dxa"/>
+            <w:tcW w:w="5227" w:type="dxa"/>
             <w:tcBorders>
               <w:left w:val="single" w:sz="2" w:space="0" w:color="808080"/>
               <w:bottom w:val="single" w:sz="2" w:space="0" w:color="808080"/>
@@ -18126,7 +18168,7 @@
         <w:trPr/>
         <w:tc>
           <w:tcPr>
-            <w:tcW w:w="2581" w:type="dxa"/>
+            <w:tcW w:w="3088" w:type="dxa"/>
             <w:tcBorders>
               <w:left w:val="single" w:sz="6" w:space="0" w:color="808080"/>
               <w:bottom w:val="single" w:sz="2" w:space="0" w:color="808080"/>
@@ -18151,7 +18193,7 @@
         </w:tc>
         <w:tc>
           <w:tcPr>
-            <w:tcW w:w="2013" w:type="dxa"/>
+            <w:tcW w:w="1890" w:type="dxa"/>
             <w:tcBorders>
               <w:left w:val="single" w:sz="2" w:space="0" w:color="808080"/>
               <w:bottom w:val="single" w:sz="2" w:space="0" w:color="808080"/>
@@ -18176,7 +18218,7 @@
         </w:tc>
         <w:tc>
           <w:tcPr>
-            <w:tcW w:w="5611" w:type="dxa"/>
+            <w:tcW w:w="5227" w:type="dxa"/>
             <w:tcBorders>
               <w:left w:val="single" w:sz="2" w:space="0" w:color="808080"/>
               <w:bottom w:val="single" w:sz="2" w:space="0" w:color="808080"/>
@@ -18204,7 +18246,7 @@
         <w:trPr/>
         <w:tc>
           <w:tcPr>
-            <w:tcW w:w="2581" w:type="dxa"/>
+            <w:tcW w:w="3088" w:type="dxa"/>
             <w:tcBorders>
               <w:left w:val="single" w:sz="6" w:space="0" w:color="808080"/>
               <w:bottom w:val="single" w:sz="2" w:space="0" w:color="808080"/>
@@ -18229,7 +18271,7 @@
         </w:tc>
         <w:tc>
           <w:tcPr>
-            <w:tcW w:w="2013" w:type="dxa"/>
+            <w:tcW w:w="1890" w:type="dxa"/>
             <w:tcBorders>
               <w:left w:val="single" w:sz="2" w:space="0" w:color="808080"/>
               <w:bottom w:val="single" w:sz="2" w:space="0" w:color="808080"/>
@@ -18254,7 +18296,7 @@
         </w:tc>
         <w:tc>
           <w:tcPr>
-            <w:tcW w:w="5611" w:type="dxa"/>
+            <w:tcW w:w="5227" w:type="dxa"/>
             <w:tcBorders>
               <w:left w:val="single" w:sz="2" w:space="0" w:color="808080"/>
               <w:bottom w:val="single" w:sz="2" w:space="0" w:color="808080"/>
@@ -18292,7 +18334,7 @@
         <w:trPr/>
         <w:tc>
           <w:tcPr>
-            <w:tcW w:w="2581" w:type="dxa"/>
+            <w:tcW w:w="3088" w:type="dxa"/>
             <w:tcBorders>
               <w:left w:val="single" w:sz="6" w:space="0" w:color="808080"/>
               <w:bottom w:val="single" w:sz="2" w:space="0" w:color="808080"/>
@@ -18317,7 +18359,7 @@
         </w:tc>
         <w:tc>
           <w:tcPr>
-            <w:tcW w:w="2013" w:type="dxa"/>
+            <w:tcW w:w="1890" w:type="dxa"/>
             <w:tcBorders>
               <w:left w:val="single" w:sz="2" w:space="0" w:color="808080"/>
               <w:bottom w:val="single" w:sz="2" w:space="0" w:color="808080"/>
@@ -18342,7 +18384,7 @@
         </w:tc>
         <w:tc>
           <w:tcPr>
-            <w:tcW w:w="5611" w:type="dxa"/>
+            <w:tcW w:w="5227" w:type="dxa"/>
             <w:tcBorders>
               <w:left w:val="single" w:sz="2" w:space="0" w:color="808080"/>
               <w:bottom w:val="single" w:sz="2" w:space="0" w:color="808080"/>
@@ -18386,7 +18428,7 @@
         <w:trPr/>
         <w:tc>
           <w:tcPr>
-            <w:tcW w:w="2581" w:type="dxa"/>
+            <w:tcW w:w="3088" w:type="dxa"/>
             <w:tcBorders>
               <w:left w:val="single" w:sz="6" w:space="0" w:color="808080"/>
               <w:bottom w:val="single" w:sz="2" w:space="0" w:color="808080"/>
@@ -18411,7 +18453,7 @@
         </w:tc>
         <w:tc>
           <w:tcPr>
-            <w:tcW w:w="2013" w:type="dxa"/>
+            <w:tcW w:w="1890" w:type="dxa"/>
             <w:tcBorders>
               <w:left w:val="single" w:sz="2" w:space="0" w:color="808080"/>
               <w:bottom w:val="single" w:sz="2" w:space="0" w:color="808080"/>
@@ -18436,7 +18478,7 @@
         </w:tc>
         <w:tc>
           <w:tcPr>
-            <w:tcW w:w="5611" w:type="dxa"/>
+            <w:tcW w:w="5227" w:type="dxa"/>
             <w:tcBorders>
               <w:left w:val="single" w:sz="2" w:space="0" w:color="808080"/>
               <w:bottom w:val="single" w:sz="2" w:space="0" w:color="808080"/>
@@ -18484,7 +18526,7 @@
         <w:trPr/>
         <w:tc>
           <w:tcPr>
-            <w:tcW w:w="2581" w:type="dxa"/>
+            <w:tcW w:w="3088" w:type="dxa"/>
             <w:tcBorders>
               <w:left w:val="single" w:sz="6" w:space="0" w:color="808080"/>
               <w:bottom w:val="single" w:sz="2" w:space="0" w:color="808080"/>
@@ -18509,7 +18551,7 @@
         </w:tc>
         <w:tc>
           <w:tcPr>
-            <w:tcW w:w="2013" w:type="dxa"/>
+            <w:tcW w:w="1890" w:type="dxa"/>
             <w:tcBorders>
               <w:left w:val="single" w:sz="2" w:space="0" w:color="808080"/>
               <w:bottom w:val="single" w:sz="2" w:space="0" w:color="808080"/>
@@ -18534,7 +18576,7 @@
         </w:tc>
         <w:tc>
           <w:tcPr>
-            <w:tcW w:w="5611" w:type="dxa"/>
+            <w:tcW w:w="5227" w:type="dxa"/>
             <w:tcBorders>
               <w:left w:val="single" w:sz="2" w:space="0" w:color="808080"/>
               <w:bottom w:val="single" w:sz="2" w:space="0" w:color="808080"/>
@@ -18578,7 +18620,7 @@
         <w:trPr/>
         <w:tc>
           <w:tcPr>
-            <w:tcW w:w="2581" w:type="dxa"/>
+            <w:tcW w:w="3088" w:type="dxa"/>
             <w:tcBorders>
               <w:left w:val="single" w:sz="6" w:space="0" w:color="808080"/>
               <w:bottom w:val="single" w:sz="2" w:space="0" w:color="808080"/>
@@ -18603,7 +18645,7 @@
         </w:tc>
         <w:tc>
           <w:tcPr>
-            <w:tcW w:w="2013" w:type="dxa"/>
+            <w:tcW w:w="1890" w:type="dxa"/>
             <w:tcBorders>
               <w:left w:val="single" w:sz="2" w:space="0" w:color="808080"/>
               <w:bottom w:val="single" w:sz="2" w:space="0" w:color="808080"/>
@@ -18628,7 +18670,7 @@
         </w:tc>
         <w:tc>
           <w:tcPr>
-            <w:tcW w:w="5611" w:type="dxa"/>
+            <w:tcW w:w="5227" w:type="dxa"/>
             <w:tcBorders>
               <w:left w:val="single" w:sz="2" w:space="0" w:color="808080"/>
               <w:bottom w:val="single" w:sz="2" w:space="0" w:color="808080"/>
@@ -18666,7 +18708,7 @@
         <w:trPr/>
         <w:tc>
           <w:tcPr>
-            <w:tcW w:w="2581" w:type="dxa"/>
+            <w:tcW w:w="3088" w:type="dxa"/>
             <w:tcBorders>
               <w:left w:val="single" w:sz="6" w:space="0" w:color="808080"/>
               <w:bottom w:val="single" w:sz="2" w:space="0" w:color="808080"/>
@@ -18691,7 +18733,7 @@
         </w:tc>
         <w:tc>
           <w:tcPr>
-            <w:tcW w:w="2013" w:type="dxa"/>
+            <w:tcW w:w="1890" w:type="dxa"/>
             <w:tcBorders>
               <w:left w:val="single" w:sz="2" w:space="0" w:color="808080"/>
               <w:bottom w:val="single" w:sz="2" w:space="0" w:color="808080"/>
@@ -18716,7 +18758,7 @@
         </w:tc>
         <w:tc>
           <w:tcPr>
-            <w:tcW w:w="5611" w:type="dxa"/>
+            <w:tcW w:w="5227" w:type="dxa"/>
             <w:tcBorders>
               <w:left w:val="single" w:sz="2" w:space="0" w:color="808080"/>
               <w:bottom w:val="single" w:sz="2" w:space="0" w:color="808080"/>
@@ -18754,7 +18796,95 @@
         <w:trPr/>
         <w:tc>
           <w:tcPr>
-            <w:tcW w:w="2581" w:type="dxa"/>
+            <w:tcW w:w="3088" w:type="dxa"/>
+            <w:tcBorders>
+              <w:left w:val="single" w:sz="6" w:space="0" w:color="808080"/>
+              <w:bottom w:val="single" w:sz="2" w:space="0" w:color="808080"/>
+              <w:right w:val="single" w:sz="6" w:space="0" w:color="808080"/>
+            </w:tcBorders>
+            <w:vAlign w:val="center"/>
+          </w:tcPr>
+          <w:p>
+            <w:pPr>
+              <w:pStyle w:val="TableContents"/>
+              <w:widowControl w:val="false"/>
+              <w:suppressLineNumbers/>
+              <w:bidi w:val="0"/>
+              <w:jc w:val="left"/>
+              <w:rPr/>
+            </w:pPr>
+            <w:r>
+              <w:rPr/>
+              <w:t>A7 CLI printed "Undone." and then "Nothing to undo."</w:t>
+            </w:r>
+          </w:p>
+        </w:tc>
+        <w:tc>
+          <w:tcPr>
+            <w:tcW w:w="1890" w:type="dxa"/>
+            <w:tcBorders>
+              <w:left w:val="single" w:sz="2" w:space="0" w:color="808080"/>
+              <w:bottom w:val="single" w:sz="2" w:space="0" w:color="808080"/>
+              <w:right w:val="single" w:sz="6" w:space="0" w:color="808080"/>
+            </w:tcBorders>
+            <w:vAlign w:val="center"/>
+          </w:tcPr>
+          <w:p>
+            <w:pPr>
+              <w:pStyle w:val="TableContents"/>
+              <w:widowControl w:val="false"/>
+              <w:suppressLineNumbers/>
+              <w:bidi w:val="0"/>
+              <w:jc w:val="left"/>
+              <w:rPr/>
+            </w:pPr>
+            <w:r>
+              <w:rPr/>
+              <w:t>checking every error case for the demo script</w:t>
+            </w:r>
+          </w:p>
+        </w:tc>
+        <w:tc>
+          <w:tcPr>
+            <w:tcW w:w="5227" w:type="dxa"/>
+            <w:tcBorders>
+              <w:left w:val="single" w:sz="2" w:space="0" w:color="808080"/>
+              <w:bottom w:val="single" w:sz="2" w:space="0" w:color="808080"/>
+              <w:right w:val="single" w:sz="6" w:space="0" w:color="808080"/>
+            </w:tcBorders>
+            <w:vAlign w:val="center"/>
+          </w:tcPr>
+          <w:p>
+            <w:pPr>
+              <w:pStyle w:val="TableContents"/>
+              <w:widowControl w:val="false"/>
+              <w:suppressLineNumbers/>
+              <w:bidi w:val="0"/>
+              <w:jc w:val="left"/>
+              <w:rPr/>
+            </w:pPr>
+            <w:r>
+              <w:rPr/>
+              <w:t>undo first, print after; new CLI test (</w:t>
+            </w:r>
+            <w:r>
+              <w:rPr>
+                <w:rStyle w:val="SourceText"/>
+              </w:rPr>
+              <w:t>f8fe10f</w:t>
+            </w:r>
+            <w:r>
+              <w:rPr/>
+              <w:t>)</w:t>
+            </w:r>
+          </w:p>
+        </w:tc>
+      </w:tr>
+      <w:tr>
+        <w:trPr/>
+        <w:tc>
+          <w:tcPr>
+            <w:tcW w:w="3088" w:type="dxa"/>
             <w:tcBorders>
               <w:left w:val="single" w:sz="6" w:space="0" w:color="808080"/>
               <w:bottom w:val="single" w:sz="6" w:space="0" w:color="808080"/>
@@ -18773,13 +18903,13 @@
             </w:pPr>
             <w:r>
               <w:rPr/>
-              <w:t>A7 CLI printed "Undone." and then "Nothing to undo."</w:t>
-            </w:r>
-          </w:p>
-        </w:tc>
-        <w:tc>
-          <w:tcPr>
-            <w:tcW w:w="2013" w:type="dxa"/>
+              <w:t>A8 "dinner for 9.5 days" made a 5-day plan; decimal time limits and servings were ignored</w:t>
+            </w:r>
+          </w:p>
+        </w:tc>
+        <w:tc>
+          <w:tcPr>
+            <w:tcW w:w="1890" w:type="dxa"/>
             <w:tcBorders>
               <w:left w:val="single" w:sz="2" w:space="0" w:color="808080"/>
               <w:bottom w:val="single" w:sz="6" w:space="0" w:color="808080"/>
@@ -18798,13 +18928,13 @@
             </w:pPr>
             <w:r>
               <w:rPr/>
-              <w:t>checking every error case for the demo script</w:t>
-            </w:r>
-          </w:p>
-        </w:tc>
-        <w:tc>
-          <w:tcPr>
-            <w:tcW w:w="5611" w:type="dxa"/>
+              <w:t>reported by the author while testing</w:t>
+            </w:r>
+          </w:p>
+        </w:tc>
+        <w:tc>
+          <w:tcPr>
+            <w:tcW w:w="5227" w:type="dxa"/>
             <w:tcBorders>
               <w:left w:val="single" w:sz="2" w:space="0" w:color="808080"/>
               <w:bottom w:val="single" w:sz="6" w:space="0" w:color="808080"/>
@@ -18823,17 +18953,17 @@
             </w:pPr>
             <w:r>
               <w:rPr/>
-              <w:t>undo first, print after; new CLI test (</w:t>
-            </w:r>
-            <w:r>
-              <w:rPr>
-                <w:rStyle w:val="Strong"/>
-              </w:rPr>
-              <w:t>[Team]</w:t>
-            </w:r>
-            <w:r>
-              <w:rPr/>
-              <w:t xml:space="preserve"> commit id)</w:t>
+              <w:t>decimals read and rounded, a half toward 5–7 days; huge numbers are an error (</w:t>
+            </w:r>
+            <w:r>
+              <w:rPr>
+                <w:rStyle w:val="SourceText"/>
+              </w:rPr>
+              <w:t>c022ae4</w:t>
+            </w:r>
+            <w:r>
+              <w:rPr/>
+              <w:t>)</w:t>
             </w:r>
           </w:p>
         </w:tc>
@@ -18905,17 +19035,7 @@
       </w:r>
       <w:r>
         <w:rPr/>
-        <w:t xml:space="preserve">. </w:t>
-      </w:r>
-      <w:r>
-        <w:rPr>
-          <w:rStyle w:val="Strong"/>
-        </w:rPr>
-        <w:t>[Team]</w:t>
-      </w:r>
-      <w:r>
-        <w:rPr/>
-        <w:t xml:space="preserve"> paste the links and timestamps.</w:t>
+        <w:t>. Links and timestamps are added after recording.</w:t>
       </w:r>
     </w:p>
     <w:tbl>
@@ -19092,9 +19212,9 @@
             </w:pPr>
             <w:r>
               <w:rPr>
-                <w:rStyle w:val="Strong"/>
-              </w:rPr>
-              <w:t>[Team]</w:t>
+                <w:rStyle w:val="Emphasis"/>
+              </w:rPr>
+              <w:t>(to be added)</w:t>
             </w:r>
           </w:p>
         </w:tc>
@@ -19172,9 +19292,9 @@
             </w:pPr>
             <w:r>
               <w:rPr>
-                <w:rStyle w:val="Strong"/>
-              </w:rPr>
-              <w:t>[Team]</w:t>
+                <w:rStyle w:val="Emphasis"/>
+              </w:rPr>
+              <w:t>(to be added)</w:t>
             </w:r>
           </w:p>
         </w:tc>
@@ -19252,9 +19372,9 @@
             </w:pPr>
             <w:r>
               <w:rPr>
-                <w:rStyle w:val="Strong"/>
-              </w:rPr>
-              <w:t>[Team]</w:t>
+                <w:rStyle w:val="Emphasis"/>
+              </w:rPr>
+              <w:t>(to be added)</w:t>
             </w:r>
           </w:p>
         </w:tc>
@@ -19332,9 +19452,9 @@
             </w:pPr>
             <w:r>
               <w:rPr>
-                <w:rStyle w:val="Strong"/>
-              </w:rPr>
-              <w:t>[Team]</w:t>
+                <w:rStyle w:val="Emphasis"/>
+              </w:rPr>
+              <w:t>(to be added)</w:t>
             </w:r>
           </w:p>
         </w:tc>
@@ -19412,9 +19532,9 @@
             </w:pPr>
             <w:r>
               <w:rPr>
-                <w:rStyle w:val="Strong"/>
-              </w:rPr>
-              <w:t>[Team]</w:t>
+                <w:rStyle w:val="Emphasis"/>
+              </w:rPr>
+              <w:t>(to be added)</w:t>
             </w:r>
           </w:p>
         </w:tc>
@@ -19492,9 +19612,9 @@
             </w:pPr>
             <w:r>
               <w:rPr>
-                <w:rStyle w:val="Strong"/>
-              </w:rPr>
-              <w:t>[Team]</w:t>
+                <w:rStyle w:val="Emphasis"/>
+              </w:rPr>
+              <w:t>(to be added)</w:t>
             </w:r>
           </w:p>
         </w:tc>
@@ -19572,9 +19692,9 @@
             </w:pPr>
             <w:r>
               <w:rPr>
-                <w:rStyle w:val="Strong"/>
-              </w:rPr>
-              <w:t>[Team]</w:t>
+                <w:rStyle w:val="Emphasis"/>
+              </w:rPr>
+              <w:t>(to be added)</w:t>
             </w:r>
           </w:p>
         </w:tc>
@@ -19652,9 +19772,9 @@
             </w:pPr>
             <w:r>
               <w:rPr>
-                <w:rStyle w:val="Strong"/>
-              </w:rPr>
-              <w:t>[Team]</w:t>
+                <w:rStyle w:val="Emphasis"/>
+              </w:rPr>
+              <w:t>(to be added)</w:t>
             </w:r>
           </w:p>
         </w:tc>
@@ -19732,9 +19852,9 @@
             </w:pPr>
             <w:r>
               <w:rPr>
-                <w:rStyle w:val="Strong"/>
-              </w:rPr>
-              <w:t>[Team]</w:t>
+                <w:rStyle w:val="Emphasis"/>
+              </w:rPr>
+              <w:t>(to be added)</w:t>
             </w:r>
           </w:p>
         </w:tc>
@@ -19812,9 +19932,9 @@
             </w:pPr>
             <w:r>
               <w:rPr>
-                <w:rStyle w:val="Strong"/>
-              </w:rPr>
-              <w:t>[Team]</w:t>
+                <w:rStyle w:val="Emphasis"/>
+              </w:rPr>
+              <w:t>(to be added)</w:t>
             </w:r>
           </w:p>
         </w:tc>
@@ -19892,9 +20012,9 @@
             </w:pPr>
             <w:r>
               <w:rPr>
-                <w:rStyle w:val="Strong"/>
-              </w:rPr>
-              <w:t>[Team]</w:t>
+                <w:rStyle w:val="Emphasis"/>
+              </w:rPr>
+              <w:t>(to be added)</w:t>
             </w:r>
           </w:p>
         </w:tc>

</xml_diff>